<commit_message>
Thêm 5 ngôn ngữ trong app
</commit_message>
<xml_diff>
--- a/BaoCao_SmartTourGuide.docx
+++ b/BaoCao_SmartTourGuide.docx
@@ -14,8 +14,6 @@
           <w:szCs w:val="24"/>
         </w:rPr>
       </w:pPr>
-      <w:bookmarkStart w:id="254" w:name="_GoBack"/>
-      <w:bookmarkEnd w:id="254"/>
       <w:r>
         <w:rPr>
           <w:rFonts w:hint="default" w:ascii="Times New Roman" w:hAnsi="Times New Roman" w:cs="Times New Roman"/>
@@ -6105,11 +6103,11 @@
           <w:lang w:val="en-US"/>
         </w:rPr>
       </w:pPr>
-      <w:bookmarkStart w:id="4" w:name="_Toc30554"/>
-      <w:bookmarkStart w:id="5" w:name="_Toc22304"/>
-      <w:bookmarkStart w:id="6" w:name="_Toc11716"/>
-      <w:bookmarkStart w:id="7" w:name="_Toc6143"/>
-      <w:bookmarkStart w:id="8" w:name="_Toc22455"/>
+      <w:bookmarkStart w:id="4" w:name="_Toc11716"/>
+      <w:bookmarkStart w:id="5" w:name="_Toc30554"/>
+      <w:bookmarkStart w:id="6" w:name="_Toc6143"/>
+      <w:bookmarkStart w:id="7" w:name="_Toc22455"/>
+      <w:bookmarkStart w:id="8" w:name="_Toc22304"/>
       <w:r>
         <w:rPr>
           <w:rFonts w:hint="default" w:ascii="Times New Roman" w:hAnsi="Times New Roman" w:eastAsia="Times New Roman" w:cs="Times New Roman"/>
@@ -6235,10 +6233,10 @@
           <w:lang w:val="en-US"/>
         </w:rPr>
       </w:pPr>
-      <w:bookmarkStart w:id="9" w:name="_Toc14194"/>
+      <w:bookmarkStart w:id="9" w:name="_Toc8710"/>
       <w:bookmarkStart w:id="10" w:name="_Toc12628"/>
-      <w:bookmarkStart w:id="11" w:name="_Toc8710"/>
-      <w:bookmarkStart w:id="12" w:name="_Toc20219"/>
+      <w:bookmarkStart w:id="11" w:name="_Toc20219"/>
+      <w:bookmarkStart w:id="12" w:name="_Toc14194"/>
       <w:bookmarkStart w:id="13" w:name="_Toc11258"/>
       <w:r>
         <w:rPr>
@@ -6683,11 +6681,11 @@
           <w:lang w:val="en-US"/>
         </w:rPr>
       </w:pPr>
-      <w:bookmarkStart w:id="14" w:name="_Toc30885"/>
-      <w:bookmarkStart w:id="15" w:name="_Toc19299"/>
+      <w:bookmarkStart w:id="14" w:name="_Toc19299"/>
+      <w:bookmarkStart w:id="15" w:name="_Toc20990"/>
       <w:bookmarkStart w:id="16" w:name="_Toc27726"/>
       <w:bookmarkStart w:id="17" w:name="_Toc18394"/>
-      <w:bookmarkStart w:id="18" w:name="_Toc20990"/>
+      <w:bookmarkStart w:id="18" w:name="_Toc30885"/>
       <w:r>
         <w:rPr>
           <w:rFonts w:hint="default" w:ascii="Times New Roman" w:hAnsi="Times New Roman" w:eastAsia="Times New Roman" w:cs="Times New Roman"/>
@@ -7485,11 +7483,11 @@
           <w:lang w:val="en-US"/>
         </w:rPr>
       </w:pPr>
-      <w:bookmarkStart w:id="19" w:name="_Toc18331"/>
-      <w:bookmarkStart w:id="20" w:name="_Toc29670"/>
-      <w:bookmarkStart w:id="21" w:name="_Toc7076"/>
-      <w:bookmarkStart w:id="22" w:name="_Toc30018"/>
-      <w:bookmarkStart w:id="23" w:name="_Toc6514"/>
+      <w:bookmarkStart w:id="19" w:name="_Toc7076"/>
+      <w:bookmarkStart w:id="20" w:name="_Toc6514"/>
+      <w:bookmarkStart w:id="21" w:name="_Toc18331"/>
+      <w:bookmarkStart w:id="22" w:name="_Toc29670"/>
+      <w:bookmarkStart w:id="23" w:name="_Toc30018"/>
       <w:r>
         <w:rPr>
           <w:rFonts w:hint="default" w:ascii="Times New Roman" w:hAnsi="Times New Roman" w:eastAsia="Times New Roman" w:cs="Times New Roman"/>
@@ -7546,11 +7544,11 @@
           <w:lang w:val="en-US"/>
         </w:rPr>
       </w:pPr>
-      <w:bookmarkStart w:id="24" w:name="_Toc17992"/>
-      <w:bookmarkStart w:id="25" w:name="_Toc3959"/>
-      <w:bookmarkStart w:id="26" w:name="_Toc17304"/>
-      <w:bookmarkStart w:id="27" w:name="_Toc23636"/>
-      <w:bookmarkStart w:id="28" w:name="_Toc18186"/>
+      <w:bookmarkStart w:id="24" w:name="_Toc3959"/>
+      <w:bookmarkStart w:id="25" w:name="_Toc18186"/>
+      <w:bookmarkStart w:id="26" w:name="_Toc23636"/>
+      <w:bookmarkStart w:id="27" w:name="_Toc17992"/>
+      <w:bookmarkStart w:id="28" w:name="_Toc17304"/>
       <w:r>
         <w:rPr>
           <w:rFonts w:hint="default" w:ascii="Times New Roman" w:hAnsi="Times New Roman" w:eastAsia="Times New Roman" w:cs="Times New Roman"/>
@@ -7768,10 +7766,10 @@
         </w:rPr>
       </w:pPr>
       <w:bookmarkStart w:id="29" w:name="_Toc5207"/>
-      <w:bookmarkStart w:id="30" w:name="_Toc20505"/>
-      <w:bookmarkStart w:id="31" w:name="_Toc8326"/>
-      <w:bookmarkStart w:id="32" w:name="_Toc4631"/>
-      <w:bookmarkStart w:id="33" w:name="_Toc13682"/>
+      <w:bookmarkStart w:id="30" w:name="_Toc13682"/>
+      <w:bookmarkStart w:id="31" w:name="_Toc4631"/>
+      <w:bookmarkStart w:id="32" w:name="_Toc20505"/>
+      <w:bookmarkStart w:id="33" w:name="_Toc8326"/>
       <w:r>
         <w:rPr>
           <w:rFonts w:hint="default" w:ascii="Times New Roman" w:hAnsi="Times New Roman" w:eastAsia="Times New Roman" w:cs="Times New Roman"/>
@@ -8448,11 +8446,11 @@
           <w:lang w:val="en-US"/>
         </w:rPr>
       </w:pPr>
-      <w:bookmarkStart w:id="34" w:name="_Toc16461"/>
-      <w:bookmarkStart w:id="35" w:name="_Toc10891"/>
+      <w:bookmarkStart w:id="34" w:name="_Toc26460"/>
+      <w:bookmarkStart w:id="35" w:name="_Toc16461"/>
       <w:bookmarkStart w:id="36" w:name="_Toc22118"/>
-      <w:bookmarkStart w:id="37" w:name="_Toc16796"/>
-      <w:bookmarkStart w:id="38" w:name="_Toc26460"/>
+      <w:bookmarkStart w:id="37" w:name="_Toc10891"/>
+      <w:bookmarkStart w:id="38" w:name="_Toc16796"/>
       <w:r>
         <w:rPr>
           <w:rFonts w:hint="default" w:ascii="Times New Roman" w:hAnsi="Times New Roman" w:eastAsia="Times New Roman" w:cs="Times New Roman"/>
@@ -8555,11 +8553,11 @@
           <w:lang w:val="en-US"/>
         </w:rPr>
       </w:pPr>
-      <w:bookmarkStart w:id="39" w:name="_Toc23769"/>
+      <w:bookmarkStart w:id="39" w:name="_Toc30280"/>
       <w:bookmarkStart w:id="40" w:name="_Toc31643"/>
       <w:bookmarkStart w:id="41" w:name="_Toc29924"/>
-      <w:bookmarkStart w:id="42" w:name="_Toc1942"/>
-      <w:bookmarkStart w:id="43" w:name="_Toc30280"/>
+      <w:bookmarkStart w:id="42" w:name="_Toc23769"/>
+      <w:bookmarkStart w:id="43" w:name="_Toc1942"/>
       <w:r>
         <w:rPr>
           <w:rFonts w:hint="default" w:ascii="Times New Roman" w:hAnsi="Times New Roman" w:eastAsia="Times New Roman" w:cs="Times New Roman"/>
@@ -8615,11 +8613,11 @@
           <w:szCs w:val="24"/>
         </w:rPr>
       </w:pPr>
-      <w:bookmarkStart w:id="44" w:name="_Toc30046"/>
-      <w:bookmarkStart w:id="45" w:name="_Toc30882"/>
+      <w:bookmarkStart w:id="44" w:name="_Toc12214"/>
+      <w:bookmarkStart w:id="45" w:name="_Toc30046"/>
       <w:bookmarkStart w:id="46" w:name="_Toc30045"/>
-      <w:bookmarkStart w:id="47" w:name="_Toc12214"/>
-      <w:bookmarkStart w:id="48" w:name="_Toc16998"/>
+      <w:bookmarkStart w:id="47" w:name="_Toc16998"/>
+      <w:bookmarkStart w:id="48" w:name="_Toc30882"/>
       <w:r>
         <w:rPr>
           <w:rFonts w:hint="default" w:ascii="Times New Roman" w:hAnsi="Times New Roman" w:eastAsia="Times New Roman" w:cs="Times New Roman"/>
@@ -9107,11 +9105,11 @@
           <w:szCs w:val="24"/>
         </w:rPr>
       </w:pPr>
-      <w:bookmarkStart w:id="49" w:name="_Toc1035"/>
+      <w:bookmarkStart w:id="49" w:name="_Toc4672"/>
       <w:bookmarkStart w:id="50" w:name="_Toc18257"/>
       <w:bookmarkStart w:id="51" w:name="_Toc19243"/>
-      <w:bookmarkStart w:id="52" w:name="_Toc4672"/>
-      <w:bookmarkStart w:id="53" w:name="_Toc13063"/>
+      <w:bookmarkStart w:id="52" w:name="_Toc13063"/>
+      <w:bookmarkStart w:id="53" w:name="_Toc1035"/>
       <w:r>
         <w:rPr>
           <w:rFonts w:hint="default" w:ascii="Times New Roman" w:hAnsi="Times New Roman" w:eastAsia="Times New Roman" w:cs="Times New Roman"/>
@@ -9541,11 +9539,11 @@
           <w:szCs w:val="24"/>
         </w:rPr>
       </w:pPr>
-      <w:bookmarkStart w:id="54" w:name="_Toc20310"/>
-      <w:bookmarkStart w:id="55" w:name="_Toc12119"/>
-      <w:bookmarkStart w:id="56" w:name="_Toc22249"/>
-      <w:bookmarkStart w:id="57" w:name="_Toc3269"/>
-      <w:bookmarkStart w:id="58" w:name="_Toc12367"/>
+      <w:bookmarkStart w:id="54" w:name="_Toc22249"/>
+      <w:bookmarkStart w:id="55" w:name="_Toc12367"/>
+      <w:bookmarkStart w:id="56" w:name="_Toc20310"/>
+      <w:bookmarkStart w:id="57" w:name="_Toc12119"/>
+      <w:bookmarkStart w:id="58" w:name="_Toc3269"/>
       <w:r>
         <w:rPr>
           <w:rFonts w:hint="default" w:ascii="Times New Roman" w:hAnsi="Times New Roman" w:eastAsia="Times New Roman" w:cs="Times New Roman"/>
@@ -9908,11 +9906,11 @@
           <w:lang w:val="en-US"/>
         </w:rPr>
       </w:pPr>
-      <w:bookmarkStart w:id="64" w:name="_Toc5688"/>
+      <w:bookmarkStart w:id="64" w:name="_Toc5100"/>
       <w:bookmarkStart w:id="65" w:name="_Toc32586"/>
-      <w:bookmarkStart w:id="66" w:name="_Toc5100"/>
-      <w:bookmarkStart w:id="67" w:name="_Toc12672"/>
-      <w:bookmarkStart w:id="68" w:name="_Toc28980"/>
+      <w:bookmarkStart w:id="66" w:name="_Toc12672"/>
+      <w:bookmarkStart w:id="67" w:name="_Toc28980"/>
+      <w:bookmarkStart w:id="68" w:name="_Toc5688"/>
       <w:r>
         <w:rPr>
           <w:rFonts w:hint="default" w:ascii="Times New Roman" w:hAnsi="Times New Roman" w:eastAsia="Times New Roman" w:cs="Times New Roman"/>
@@ -10258,6 +10256,8 @@
         </w:rPr>
         <w:t>Thay vì sử dụng các API Text-to-Speech trả phí (Google Cloud TTS, Azure Cognitive Services), dự án tận dụng endpoint không cần key của Google Translate để tiết kiệm chi phí. Hệ thống tự động chia văn bản dài thành các đoạn 180 ký tự (chunk), gọi API lần lượt rồi ghép các file MP3 lại. Cơ chế này giúp bypass giới hạn ký tự của API miễn phí.</w:t>
       </w:r>
+      <w:bookmarkStart w:id="254" w:name="_GoBack"/>
+      <w:bookmarkEnd w:id="254"/>
     </w:p>
     <w:p>
       <w:pPr>
@@ -10531,11 +10531,11 @@
           <w:szCs w:val="24"/>
         </w:rPr>
       </w:pPr>
-      <w:bookmarkStart w:id="74" w:name="_Toc191"/>
-      <w:bookmarkStart w:id="75" w:name="_Toc15031"/>
-      <w:bookmarkStart w:id="76" w:name="_Toc15296"/>
-      <w:bookmarkStart w:id="77" w:name="_Toc405"/>
-      <w:bookmarkStart w:id="78" w:name="_Toc16801"/>
+      <w:bookmarkStart w:id="74" w:name="_Toc15296"/>
+      <w:bookmarkStart w:id="75" w:name="_Toc405"/>
+      <w:bookmarkStart w:id="76" w:name="_Toc15031"/>
+      <w:bookmarkStart w:id="77" w:name="_Toc16801"/>
+      <w:bookmarkStart w:id="78" w:name="_Toc191"/>
       <w:r>
         <w:rPr>
           <w:rFonts w:hint="default" w:ascii="Times New Roman" w:hAnsi="Times New Roman" w:eastAsia="Times New Roman" w:cs="Times New Roman"/>
@@ -10797,11 +10797,11 @@
           <w:szCs w:val="24"/>
         </w:rPr>
       </w:pPr>
-      <w:bookmarkStart w:id="79" w:name="_Toc30506"/>
-      <w:bookmarkStart w:id="80" w:name="_Toc2577"/>
-      <w:bookmarkStart w:id="81" w:name="_Toc8733"/>
-      <w:bookmarkStart w:id="82" w:name="_Toc14270"/>
-      <w:bookmarkStart w:id="83" w:name="_Toc18484"/>
+      <w:bookmarkStart w:id="79" w:name="_Toc14270"/>
+      <w:bookmarkStart w:id="80" w:name="_Toc18484"/>
+      <w:bookmarkStart w:id="81" w:name="_Toc30506"/>
+      <w:bookmarkStart w:id="82" w:name="_Toc2577"/>
+      <w:bookmarkStart w:id="83" w:name="_Toc8733"/>
       <w:r>
         <w:rPr>
           <w:rFonts w:hint="default" w:ascii="Times New Roman" w:hAnsi="Times New Roman" w:eastAsia="Times New Roman" w:cs="Times New Roman"/>
@@ -11161,9 +11161,9 @@
       </w:pPr>
       <w:bookmarkStart w:id="84" w:name="_Toc26160"/>
       <w:bookmarkStart w:id="85" w:name="_Toc23989"/>
-      <w:bookmarkStart w:id="86" w:name="_Toc21819"/>
+      <w:bookmarkStart w:id="86" w:name="_Toc2989"/>
       <w:bookmarkStart w:id="87" w:name="_Toc27861"/>
-      <w:bookmarkStart w:id="88" w:name="_Toc2989"/>
+      <w:bookmarkStart w:id="88" w:name="_Toc21819"/>
       <w:r>
         <w:rPr>
           <w:rFonts w:hint="default" w:ascii="Times New Roman" w:hAnsi="Times New Roman" w:eastAsia="Times New Roman" w:cs="Times New Roman"/>
@@ -11631,9 +11631,9 @@
       </w:pPr>
       <w:bookmarkStart w:id="89" w:name="_Toc6225"/>
       <w:bookmarkStart w:id="90" w:name="_Toc7823"/>
-      <w:bookmarkStart w:id="91" w:name="_Toc26947"/>
+      <w:bookmarkStart w:id="91" w:name="_Toc23100"/>
       <w:bookmarkStart w:id="92" w:name="_Toc1113"/>
-      <w:bookmarkStart w:id="93" w:name="_Toc23100"/>
+      <w:bookmarkStart w:id="93" w:name="_Toc26947"/>
       <w:r>
         <w:rPr>
           <w:rFonts w:hint="default" w:ascii="Times New Roman" w:hAnsi="Times New Roman" w:eastAsia="Times New Roman" w:cs="Times New Roman"/>
@@ -11714,10 +11714,10 @@
         </w:rPr>
       </w:pPr>
       <w:bookmarkStart w:id="94" w:name="_Toc29530"/>
-      <w:bookmarkStart w:id="95" w:name="_Toc18070"/>
-      <w:bookmarkStart w:id="96" w:name="_Toc304"/>
-      <w:bookmarkStart w:id="97" w:name="_Toc23550"/>
-      <w:bookmarkStart w:id="98" w:name="_Toc7975"/>
+      <w:bookmarkStart w:id="95" w:name="_Toc23550"/>
+      <w:bookmarkStart w:id="96" w:name="_Toc7975"/>
+      <w:bookmarkStart w:id="97" w:name="_Toc18070"/>
+      <w:bookmarkStart w:id="98" w:name="_Toc304"/>
       <w:r>
         <w:rPr>
           <w:rFonts w:hint="default" w:ascii="Times New Roman" w:hAnsi="Times New Roman" w:eastAsia="Times New Roman" w:cs="Times New Roman"/>
@@ -12949,11 +12949,11 @@
           <w:lang w:val="en-US"/>
         </w:rPr>
       </w:pPr>
-      <w:bookmarkStart w:id="99" w:name="_Toc4498"/>
-      <w:bookmarkStart w:id="100" w:name="_Toc30378"/>
-      <w:bookmarkStart w:id="101" w:name="_Toc26837"/>
+      <w:bookmarkStart w:id="99" w:name="_Toc26837"/>
+      <w:bookmarkStart w:id="100" w:name="_Toc23553"/>
+      <w:bookmarkStart w:id="101" w:name="_Toc30378"/>
       <w:bookmarkStart w:id="102" w:name="_Toc4237"/>
-      <w:bookmarkStart w:id="103" w:name="_Toc23553"/>
+      <w:bookmarkStart w:id="103" w:name="_Toc4498"/>
       <w:r>
         <w:rPr>
           <w:rFonts w:hint="default" w:ascii="Times New Roman" w:hAnsi="Times New Roman" w:eastAsia="Times New Roman" w:cs="Times New Roman"/>
@@ -13013,11 +13013,11 @@
           <w:lang w:val="en-US"/>
         </w:rPr>
       </w:pPr>
-      <w:bookmarkStart w:id="104" w:name="_Toc8378"/>
-      <w:bookmarkStart w:id="105" w:name="_Toc9657"/>
-      <w:bookmarkStart w:id="106" w:name="_Toc18880"/>
-      <w:bookmarkStart w:id="107" w:name="_Toc20323"/>
-      <w:bookmarkStart w:id="108" w:name="_Toc32427"/>
+      <w:bookmarkStart w:id="104" w:name="_Toc20323"/>
+      <w:bookmarkStart w:id="105" w:name="_Toc8378"/>
+      <w:bookmarkStart w:id="106" w:name="_Toc32427"/>
+      <w:bookmarkStart w:id="107" w:name="_Toc18880"/>
+      <w:bookmarkStart w:id="108" w:name="_Toc9657"/>
       <w:r>
         <w:rPr>
           <w:rFonts w:hint="default" w:ascii="Times New Roman" w:hAnsi="Times New Roman" w:eastAsia="Times New Roman" w:cs="Times New Roman"/>
@@ -17530,11 +17530,11 @@
           <w:lang w:val="en-US"/>
         </w:rPr>
       </w:pPr>
-      <w:bookmarkStart w:id="114" w:name="_Toc2921"/>
-      <w:bookmarkStart w:id="115" w:name="_Toc8633"/>
-      <w:bookmarkStart w:id="116" w:name="_Toc228"/>
-      <w:bookmarkStart w:id="117" w:name="_Toc27768"/>
-      <w:bookmarkStart w:id="118" w:name="_Toc3139"/>
+      <w:bookmarkStart w:id="114" w:name="_Toc8633"/>
+      <w:bookmarkStart w:id="115" w:name="_Toc3139"/>
+      <w:bookmarkStart w:id="116" w:name="_Toc27768"/>
+      <w:bookmarkStart w:id="117" w:name="_Toc2921"/>
+      <w:bookmarkStart w:id="118" w:name="_Toc228"/>
       <w:r>
         <w:rPr>
           <w:rFonts w:hint="default" w:ascii="Times New Roman" w:hAnsi="Times New Roman" w:eastAsia="Times New Roman" w:cs="Times New Roman"/>
@@ -17592,10 +17592,10 @@
         </w:rPr>
       </w:pPr>
       <w:bookmarkStart w:id="119" w:name="_Toc14957"/>
-      <w:bookmarkStart w:id="120" w:name="_Toc2996"/>
-      <w:bookmarkStart w:id="121" w:name="_Toc19874"/>
-      <w:bookmarkStart w:id="122" w:name="_Toc13094"/>
-      <w:bookmarkStart w:id="123" w:name="_Toc4668"/>
+      <w:bookmarkStart w:id="120" w:name="_Toc4668"/>
+      <w:bookmarkStart w:id="121" w:name="_Toc2996"/>
+      <w:bookmarkStart w:id="122" w:name="_Toc19874"/>
+      <w:bookmarkStart w:id="123" w:name="_Toc13094"/>
       <w:r>
         <w:rPr>
           <w:rFonts w:hint="default" w:ascii="Times New Roman" w:hAnsi="Times New Roman" w:eastAsia="Times New Roman" w:cs="Times New Roman"/>
@@ -18662,11 +18662,11 @@
           <w:szCs w:val="24"/>
         </w:rPr>
       </w:pPr>
-      <w:bookmarkStart w:id="124" w:name="_Toc2072"/>
-      <w:bookmarkStart w:id="125" w:name="_Toc6540"/>
-      <w:bookmarkStart w:id="126" w:name="_Toc26060"/>
-      <w:bookmarkStart w:id="127" w:name="_Toc15550"/>
-      <w:bookmarkStart w:id="128" w:name="_Toc27091"/>
+      <w:bookmarkStart w:id="124" w:name="_Toc6540"/>
+      <w:bookmarkStart w:id="125" w:name="_Toc2072"/>
+      <w:bookmarkStart w:id="126" w:name="_Toc15550"/>
+      <w:bookmarkStart w:id="127" w:name="_Toc27091"/>
+      <w:bookmarkStart w:id="128" w:name="_Toc26060"/>
       <w:r>
         <w:rPr>
           <w:rFonts w:hint="default" w:ascii="Times New Roman" w:hAnsi="Times New Roman" w:eastAsia="Times New Roman" w:cs="Times New Roman"/>
@@ -19509,10 +19509,10 @@
         </w:rPr>
       </w:pPr>
       <w:bookmarkStart w:id="129" w:name="_Toc25967"/>
-      <w:bookmarkStart w:id="130" w:name="_Toc29385"/>
-      <w:bookmarkStart w:id="131" w:name="_Toc31863"/>
+      <w:bookmarkStart w:id="130" w:name="_Toc11356"/>
+      <w:bookmarkStart w:id="131" w:name="_Toc29385"/>
       <w:bookmarkStart w:id="132" w:name="_Toc25395"/>
-      <w:bookmarkStart w:id="133" w:name="_Toc11356"/>
+      <w:bookmarkStart w:id="133" w:name="_Toc31863"/>
       <w:r>
         <w:rPr>
           <w:rFonts w:hint="default" w:ascii="Times New Roman" w:hAnsi="Times New Roman" w:eastAsia="Times New Roman" w:cs="Times New Roman"/>
@@ -20415,10 +20415,10 @@
         </w:rPr>
       </w:pPr>
       <w:bookmarkStart w:id="134" w:name="_Toc1018"/>
-      <w:bookmarkStart w:id="135" w:name="_Toc10581"/>
-      <w:bookmarkStart w:id="136" w:name="_Toc5392"/>
+      <w:bookmarkStart w:id="135" w:name="_Toc5392"/>
+      <w:bookmarkStart w:id="136" w:name="_Toc9359"/>
       <w:bookmarkStart w:id="137" w:name="_Toc4432"/>
-      <w:bookmarkStart w:id="138" w:name="_Toc9359"/>
+      <w:bookmarkStart w:id="138" w:name="_Toc10581"/>
       <w:r>
         <w:rPr>
           <w:rFonts w:hint="default" w:ascii="Times New Roman" w:hAnsi="Times New Roman" w:eastAsia="Times New Roman" w:cs="Times New Roman"/>
@@ -20486,9 +20486,9 @@
         </w:rPr>
       </w:pPr>
       <w:bookmarkStart w:id="139" w:name="_Toc15899"/>
-      <w:bookmarkStart w:id="140" w:name="_Toc15662"/>
-      <w:bookmarkStart w:id="141" w:name="_Toc4831"/>
-      <w:bookmarkStart w:id="142" w:name="_Toc2614"/>
+      <w:bookmarkStart w:id="140" w:name="_Toc4831"/>
+      <w:bookmarkStart w:id="141" w:name="_Toc2614"/>
+      <w:bookmarkStart w:id="142" w:name="_Toc15662"/>
       <w:bookmarkStart w:id="143" w:name="_Toc16430"/>
       <w:r>
         <w:rPr>
@@ -21110,11 +21110,11 @@
           <w:szCs w:val="24"/>
         </w:rPr>
       </w:pPr>
-      <w:bookmarkStart w:id="144" w:name="_Toc12491"/>
-      <w:bookmarkStart w:id="145" w:name="_Toc23359"/>
-      <w:bookmarkStart w:id="146" w:name="_Toc26893"/>
-      <w:bookmarkStart w:id="147" w:name="_Toc31105"/>
-      <w:bookmarkStart w:id="148" w:name="_Toc29391"/>
+      <w:bookmarkStart w:id="144" w:name="_Toc26893"/>
+      <w:bookmarkStart w:id="145" w:name="_Toc12491"/>
+      <w:bookmarkStart w:id="146" w:name="_Toc31105"/>
+      <w:bookmarkStart w:id="147" w:name="_Toc29391"/>
+      <w:bookmarkStart w:id="148" w:name="_Toc23359"/>
       <w:r>
         <w:rPr>
           <w:rFonts w:hint="default" w:ascii="Times New Roman" w:hAnsi="Times New Roman" w:eastAsia="Times New Roman" w:cs="Times New Roman"/>
@@ -22977,10 +22977,10 @@
           <w:lang w:val="en-US"/>
         </w:rPr>
       </w:pPr>
-      <w:bookmarkStart w:id="154" w:name="_Toc4281"/>
-      <w:bookmarkStart w:id="155" w:name="_Toc26916"/>
-      <w:bookmarkStart w:id="156" w:name="_Toc27937"/>
-      <w:bookmarkStart w:id="157" w:name="_Toc1396"/>
+      <w:bookmarkStart w:id="154" w:name="_Toc1396"/>
+      <w:bookmarkStart w:id="155" w:name="_Toc4281"/>
+      <w:bookmarkStart w:id="156" w:name="_Toc26916"/>
+      <w:bookmarkStart w:id="157" w:name="_Toc27937"/>
       <w:bookmarkStart w:id="158" w:name="_Toc15575"/>
       <w:r>
         <w:rPr>
@@ -23061,11 +23061,11 @@
           <w:lang w:val="en-US"/>
         </w:rPr>
       </w:pPr>
-      <w:bookmarkStart w:id="159" w:name="_Toc1596"/>
+      <w:bookmarkStart w:id="159" w:name="_Toc17390"/>
       <w:bookmarkStart w:id="160" w:name="_Toc5297"/>
       <w:bookmarkStart w:id="161" w:name="_Toc812"/>
       <w:bookmarkStart w:id="162" w:name="_Toc30469"/>
-      <w:bookmarkStart w:id="163" w:name="_Toc17390"/>
+      <w:bookmarkStart w:id="163" w:name="_Toc1596"/>
       <w:r>
         <w:rPr>
           <w:rFonts w:hint="default" w:ascii="Times New Roman" w:hAnsi="Times New Roman" w:eastAsia="Times New Roman" w:cs="Times New Roman"/>
@@ -24504,11 +24504,11 @@
           <w:szCs w:val="26"/>
         </w:rPr>
       </w:pPr>
-      <w:bookmarkStart w:id="164" w:name="_Toc2554"/>
-      <w:bookmarkStart w:id="165" w:name="_Toc12302"/>
-      <w:bookmarkStart w:id="166" w:name="_Toc25553"/>
-      <w:bookmarkStart w:id="167" w:name="_Toc30083"/>
-      <w:bookmarkStart w:id="168" w:name="_Toc17143"/>
+      <w:bookmarkStart w:id="164" w:name="_Toc30083"/>
+      <w:bookmarkStart w:id="165" w:name="_Toc25553"/>
+      <w:bookmarkStart w:id="166" w:name="_Toc2554"/>
+      <w:bookmarkStart w:id="167" w:name="_Toc17143"/>
+      <w:bookmarkStart w:id="168" w:name="_Toc12302"/>
       <w:r>
         <w:rPr>
           <w:rFonts w:hint="default" w:ascii="Times New Roman" w:hAnsi="Times New Roman" w:eastAsia="Times New Roman" w:cs="Times New Roman"/>
@@ -24621,11 +24621,11 @@
           <w:szCs w:val="24"/>
         </w:rPr>
       </w:pPr>
-      <w:bookmarkStart w:id="169" w:name="_Toc26274"/>
-      <w:bookmarkStart w:id="170" w:name="_Toc10064"/>
+      <w:bookmarkStart w:id="169" w:name="_Toc30073"/>
+      <w:bookmarkStart w:id="170" w:name="_Toc22764"/>
       <w:bookmarkStart w:id="171" w:name="_Toc23389"/>
-      <w:bookmarkStart w:id="172" w:name="_Toc22764"/>
-      <w:bookmarkStart w:id="173" w:name="_Toc30073"/>
+      <w:bookmarkStart w:id="172" w:name="_Toc10064"/>
+      <w:bookmarkStart w:id="173" w:name="_Toc26274"/>
       <w:r>
         <w:rPr>
           <w:rFonts w:hint="default" w:ascii="Times New Roman" w:hAnsi="Times New Roman" w:eastAsia="Times New Roman" w:cs="Times New Roman"/>
@@ -25313,11 +25313,11 @@
           <w:szCs w:val="24"/>
         </w:rPr>
       </w:pPr>
-      <w:bookmarkStart w:id="174" w:name="_Toc6516"/>
-      <w:bookmarkStart w:id="175" w:name="_Toc7665"/>
-      <w:bookmarkStart w:id="176" w:name="_Toc13294"/>
-      <w:bookmarkStart w:id="177" w:name="_Toc30950"/>
-      <w:bookmarkStart w:id="178" w:name="_Toc26343"/>
+      <w:bookmarkStart w:id="174" w:name="_Toc30950"/>
+      <w:bookmarkStart w:id="175" w:name="_Toc6516"/>
+      <w:bookmarkStart w:id="176" w:name="_Toc26343"/>
+      <w:bookmarkStart w:id="177" w:name="_Toc7665"/>
+      <w:bookmarkStart w:id="178" w:name="_Toc13294"/>
       <w:r>
         <w:rPr>
           <w:rFonts w:hint="default" w:ascii="Times New Roman" w:hAnsi="Times New Roman" w:eastAsia="Times New Roman" w:cs="Times New Roman"/>
@@ -26039,10 +26039,10 @@
         </w:rPr>
       </w:pPr>
       <w:bookmarkStart w:id="179" w:name="_Toc21165"/>
-      <w:bookmarkStart w:id="180" w:name="_Toc25488"/>
+      <w:bookmarkStart w:id="180" w:name="_Toc25281"/>
       <w:bookmarkStart w:id="181" w:name="_Toc26399"/>
-      <w:bookmarkStart w:id="182" w:name="_Toc25281"/>
-      <w:bookmarkStart w:id="183" w:name="_Toc24716"/>
+      <w:bookmarkStart w:id="182" w:name="_Toc24716"/>
+      <w:bookmarkStart w:id="183" w:name="_Toc25488"/>
       <w:r>
         <w:rPr>
           <w:rFonts w:hint="default" w:ascii="Times New Roman" w:hAnsi="Times New Roman" w:eastAsia="Times New Roman" w:cs="Times New Roman"/>
@@ -27091,11 +27091,11 @@
           <w:szCs w:val="24"/>
         </w:rPr>
       </w:pPr>
-      <w:bookmarkStart w:id="184" w:name="_Toc4255"/>
-      <w:bookmarkStart w:id="185" w:name="_Toc17388"/>
+      <w:bookmarkStart w:id="184" w:name="_Toc17388"/>
+      <w:bookmarkStart w:id="185" w:name="_Toc8268"/>
       <w:bookmarkStart w:id="186" w:name="_Toc32361"/>
       <w:bookmarkStart w:id="187" w:name="_Toc6673"/>
-      <w:bookmarkStart w:id="188" w:name="_Toc8268"/>
+      <w:bookmarkStart w:id="188" w:name="_Toc4255"/>
       <w:r>
         <w:rPr>
           <w:rFonts w:hint="default" w:ascii="Times New Roman" w:hAnsi="Times New Roman" w:eastAsia="Times New Roman" w:cs="Times New Roman"/>
@@ -27787,9 +27787,9 @@
         </w:rPr>
       </w:pPr>
       <w:bookmarkStart w:id="189" w:name="_Toc13193"/>
-      <w:bookmarkStart w:id="190" w:name="_Toc8705"/>
-      <w:bookmarkStart w:id="191" w:name="_Toc27696"/>
-      <w:bookmarkStart w:id="192" w:name="_Toc21668"/>
+      <w:bookmarkStart w:id="190" w:name="_Toc27696"/>
+      <w:bookmarkStart w:id="191" w:name="_Toc21668"/>
+      <w:bookmarkStart w:id="192" w:name="_Toc8705"/>
       <w:bookmarkStart w:id="193" w:name="_Toc21286"/>
       <w:r>
         <w:rPr>
@@ -28278,11 +28278,11 @@
           <w:szCs w:val="26"/>
         </w:rPr>
       </w:pPr>
-      <w:bookmarkStart w:id="194" w:name="_Toc3161"/>
+      <w:bookmarkStart w:id="194" w:name="_Toc31244"/>
       <w:bookmarkStart w:id="195" w:name="_Toc9991"/>
-      <w:bookmarkStart w:id="196" w:name="_Toc11631"/>
-      <w:bookmarkStart w:id="197" w:name="_Toc31244"/>
-      <w:bookmarkStart w:id="198" w:name="_Toc5570"/>
+      <w:bookmarkStart w:id="196" w:name="_Toc3161"/>
+      <w:bookmarkStart w:id="197" w:name="_Toc5570"/>
+      <w:bookmarkStart w:id="198" w:name="_Toc11631"/>
       <w:r>
         <w:rPr>
           <w:rFonts w:hint="default" w:ascii="Times New Roman" w:hAnsi="Times New Roman" w:eastAsia="Times New Roman" w:cs="Times New Roman"/>
@@ -33831,8 +33831,8 @@
         </w:rPr>
       </w:pPr>
       <w:bookmarkStart w:id="199" w:name="_Toc5917"/>
-      <w:bookmarkStart w:id="200" w:name="_Toc23546"/>
-      <w:bookmarkStart w:id="201" w:name="_Toc7650"/>
+      <w:bookmarkStart w:id="200" w:name="_Toc7650"/>
+      <w:bookmarkStart w:id="201" w:name="_Toc23546"/>
       <w:bookmarkStart w:id="202" w:name="_Toc9102"/>
       <w:bookmarkStart w:id="203" w:name="_Toc19757"/>
       <w:r>
@@ -33903,9 +33903,9 @@
         </w:rPr>
       </w:pPr>
       <w:bookmarkStart w:id="204" w:name="_Toc12942"/>
-      <w:bookmarkStart w:id="205" w:name="_Toc14090"/>
-      <w:bookmarkStart w:id="206" w:name="_Toc12816"/>
-      <w:bookmarkStart w:id="207" w:name="_Toc30399"/>
+      <w:bookmarkStart w:id="205" w:name="_Toc12816"/>
+      <w:bookmarkStart w:id="206" w:name="_Toc30399"/>
+      <w:bookmarkStart w:id="207" w:name="_Toc14090"/>
       <w:bookmarkStart w:id="208" w:name="_Toc7310"/>
       <w:r>
         <w:rPr>
@@ -36195,11 +36195,11 @@
           <w:lang w:val="en-US"/>
         </w:rPr>
       </w:pPr>
-      <w:bookmarkStart w:id="209" w:name="_Toc1989"/>
-      <w:bookmarkStart w:id="210" w:name="_Toc21618"/>
-      <w:bookmarkStart w:id="211" w:name="_Toc5282"/>
+      <w:bookmarkStart w:id="209" w:name="_Toc5282"/>
+      <w:bookmarkStart w:id="210" w:name="_Toc10372"/>
+      <w:bookmarkStart w:id="211" w:name="_Toc21618"/>
       <w:bookmarkStart w:id="212" w:name="_Toc12577"/>
-      <w:bookmarkStart w:id="213" w:name="_Toc10372"/>
+      <w:bookmarkStart w:id="213" w:name="_Toc1989"/>
       <w:r>
         <w:rPr>
           <w:rFonts w:hint="default" w:ascii="Times New Roman" w:hAnsi="Times New Roman" w:eastAsia="Times New Roman" w:cs="Times New Roman"/>
@@ -37851,9 +37851,9 @@
         </w:rPr>
       </w:pPr>
       <w:bookmarkStart w:id="214" w:name="_Toc30344"/>
-      <w:bookmarkStart w:id="215" w:name="_Toc16426"/>
-      <w:bookmarkStart w:id="216" w:name="_Toc592"/>
-      <w:bookmarkStart w:id="217" w:name="_Toc22429"/>
+      <w:bookmarkStart w:id="215" w:name="_Toc592"/>
+      <w:bookmarkStart w:id="216" w:name="_Toc22429"/>
+      <w:bookmarkStart w:id="217" w:name="_Toc16426"/>
       <w:bookmarkStart w:id="218" w:name="_Toc28308"/>
       <w:r>
         <w:rPr>
@@ -37934,11 +37934,11 @@
           <w:lang w:val="en-US"/>
         </w:rPr>
       </w:pPr>
-      <w:bookmarkStart w:id="219" w:name="_Toc25433"/>
-      <w:bookmarkStart w:id="220" w:name="_Toc3011"/>
-      <w:bookmarkStart w:id="221" w:name="_Toc24576"/>
-      <w:bookmarkStart w:id="222" w:name="_Toc6340"/>
-      <w:bookmarkStart w:id="223" w:name="_Toc20406"/>
+      <w:bookmarkStart w:id="219" w:name="_Toc3011"/>
+      <w:bookmarkStart w:id="220" w:name="_Toc24576"/>
+      <w:bookmarkStart w:id="221" w:name="_Toc25433"/>
+      <w:bookmarkStart w:id="222" w:name="_Toc20406"/>
+      <w:bookmarkStart w:id="223" w:name="_Toc6340"/>
       <w:r>
         <w:rPr>
           <w:rFonts w:hint="default" w:ascii="Times New Roman" w:hAnsi="Times New Roman" w:eastAsia="Times New Roman" w:cs="Times New Roman"/>
@@ -40323,11 +40323,11 @@
           <w:szCs w:val="26"/>
         </w:rPr>
       </w:pPr>
-      <w:bookmarkStart w:id="224" w:name="_Toc28222"/>
-      <w:bookmarkStart w:id="225" w:name="_Toc32003"/>
+      <w:bookmarkStart w:id="224" w:name="_Toc32003"/>
+      <w:bookmarkStart w:id="225" w:name="_Toc28222"/>
       <w:bookmarkStart w:id="226" w:name="_Toc6509"/>
-      <w:bookmarkStart w:id="227" w:name="_Toc11491"/>
-      <w:bookmarkStart w:id="228" w:name="_Toc21518"/>
+      <w:bookmarkStart w:id="227" w:name="_Toc21518"/>
+      <w:bookmarkStart w:id="228" w:name="_Toc11491"/>
       <w:r>
         <w:rPr>
           <w:rFonts w:hint="default" w:ascii="Times New Roman" w:hAnsi="Times New Roman" w:eastAsia="Times New Roman" w:cs="Times New Roman"/>
@@ -41056,11 +41056,11 @@
           <w:lang w:val="en-US"/>
         </w:rPr>
       </w:pPr>
-      <w:bookmarkStart w:id="229" w:name="_Toc25376"/>
-      <w:bookmarkStart w:id="230" w:name="_Toc11878"/>
-      <w:bookmarkStart w:id="231" w:name="_Toc24671"/>
-      <w:bookmarkStart w:id="232" w:name="_Toc13288"/>
-      <w:bookmarkStart w:id="233" w:name="_Toc24590"/>
+      <w:bookmarkStart w:id="229" w:name="_Toc24590"/>
+      <w:bookmarkStart w:id="230" w:name="_Toc13288"/>
+      <w:bookmarkStart w:id="231" w:name="_Toc11878"/>
+      <w:bookmarkStart w:id="232" w:name="_Toc25376"/>
+      <w:bookmarkStart w:id="233" w:name="_Toc24671"/>
       <w:r>
         <w:rPr>
           <w:rFonts w:hint="default" w:ascii="Times New Roman" w:hAnsi="Times New Roman" w:eastAsia="Times New Roman" w:cs="Times New Roman"/>
@@ -41117,10 +41117,10 @@
           <w:lang w:val="en-US"/>
         </w:rPr>
       </w:pPr>
-      <w:bookmarkStart w:id="234" w:name="_Toc14916"/>
-      <w:bookmarkStart w:id="235" w:name="_Toc7112"/>
-      <w:bookmarkStart w:id="236" w:name="_Toc14794"/>
-      <w:bookmarkStart w:id="237" w:name="_Toc20069"/>
+      <w:bookmarkStart w:id="234" w:name="_Toc7112"/>
+      <w:bookmarkStart w:id="235" w:name="_Toc14794"/>
+      <w:bookmarkStart w:id="236" w:name="_Toc20069"/>
+      <w:bookmarkStart w:id="237" w:name="_Toc14916"/>
       <w:bookmarkStart w:id="238" w:name="_Toc14363"/>
       <w:r>
         <w:rPr>
@@ -41517,11 +41517,11 @@
           <w:lang w:val="en-US"/>
         </w:rPr>
       </w:pPr>
-      <w:bookmarkStart w:id="239" w:name="_Toc5745"/>
-      <w:bookmarkStart w:id="240" w:name="_Toc3945"/>
-      <w:bookmarkStart w:id="241" w:name="_Toc1026"/>
+      <w:bookmarkStart w:id="239" w:name="_Toc3945"/>
+      <w:bookmarkStart w:id="240" w:name="_Toc1026"/>
+      <w:bookmarkStart w:id="241" w:name="_Toc2427"/>
       <w:bookmarkStart w:id="242" w:name="_Toc19826"/>
-      <w:bookmarkStart w:id="243" w:name="_Toc2427"/>
+      <w:bookmarkStart w:id="243" w:name="_Toc5745"/>
       <w:r>
         <w:rPr>
           <w:rFonts w:hint="default" w:ascii="Times New Roman" w:hAnsi="Times New Roman" w:eastAsia="Times New Roman" w:cs="Times New Roman"/>
@@ -41984,11 +41984,11 @@
           <w:szCs w:val="24"/>
         </w:rPr>
       </w:pPr>
-      <w:bookmarkStart w:id="244" w:name="_Toc22733"/>
-      <w:bookmarkStart w:id="245" w:name="_Toc30732"/>
-      <w:bookmarkStart w:id="246" w:name="_Toc11918"/>
-      <w:bookmarkStart w:id="247" w:name="_Toc19566"/>
-      <w:bookmarkStart w:id="248" w:name="_Toc29586"/>
+      <w:bookmarkStart w:id="244" w:name="_Toc11918"/>
+      <w:bookmarkStart w:id="245" w:name="_Toc22733"/>
+      <w:bookmarkStart w:id="246" w:name="_Toc30732"/>
+      <w:bookmarkStart w:id="247" w:name="_Toc29586"/>
+      <w:bookmarkStart w:id="248" w:name="_Toc19566"/>
       <w:r>
         <w:rPr>
           <w:rFonts w:hint="default" w:ascii="Times New Roman" w:hAnsi="Times New Roman" w:eastAsia="Times New Roman" w:cs="Times New Roman"/>
@@ -42281,11 +42281,11 @@
           <w:lang w:val="en-US"/>
         </w:rPr>
       </w:pPr>
-      <w:bookmarkStart w:id="249" w:name="_Toc25873"/>
-      <w:bookmarkStart w:id="250" w:name="_Toc28983"/>
-      <w:bookmarkStart w:id="251" w:name="_Toc5693"/>
-      <w:bookmarkStart w:id="252" w:name="_Toc21208"/>
-      <w:bookmarkStart w:id="253" w:name="_Toc5438"/>
+      <w:bookmarkStart w:id="249" w:name="_Toc28983"/>
+      <w:bookmarkStart w:id="250" w:name="_Toc21208"/>
+      <w:bookmarkStart w:id="251" w:name="_Toc5438"/>
+      <w:bookmarkStart w:id="252" w:name="_Toc25873"/>
+      <w:bookmarkStart w:id="253" w:name="_Toc5693"/>
       <w:r>
         <w:rPr>
           <w:rFonts w:hint="default" w:ascii="Times New Roman" w:hAnsi="Times New Roman" w:eastAsia="Times New Roman" w:cs="Times New Roman"/>
@@ -43508,7 +43508,40 @@
           </w14:solidFill>
         </w14:textFill>
       </w:rPr>
-      <w:t xml:space="preserve">: SMARTTOURGUIDE - </w:t>
+      <w:t xml:space="preserve">: </w:t>
+    </w:r>
+    <w:r>
+      <w:rPr>
+        <w:rFonts w:hint="default" w:cs="Times New Roman"/>
+        <w:i/>
+        <w:iCs/>
+        <w:color w:val="4F81BD" w:themeColor="accent1"/>
+        <w:sz w:val="20"/>
+        <w:szCs w:val="20"/>
+        <w:lang w:val="en-US"/>
+        <w14:textFill>
+          <w14:solidFill>
+            <w14:schemeClr w14:val="accent1"/>
+          </w14:solidFill>
+        </w14:textFill>
+      </w:rPr>
+      <w:t>C_SHARP</w:t>
+    </w:r>
+    <w:r>
+      <w:rPr>
+        <w:rFonts w:ascii="Times New Roman" w:hAnsi="Times New Roman" w:eastAsia="Times New Roman" w:cs="Times New Roman"/>
+        <w:i/>
+        <w:iCs/>
+        <w:color w:val="4F81BD" w:themeColor="accent1"/>
+        <w:sz w:val="20"/>
+        <w:szCs w:val="20"/>
+        <w14:textFill>
+          <w14:solidFill>
+            <w14:schemeClr w14:val="accent1"/>
+          </w14:solidFill>
+        </w14:textFill>
+      </w:rPr>
+      <w:t xml:space="preserve"> - </w:t>
     </w:r>
     <w:r>
       <w:rPr>

</xml_diff>

<commit_message>
Chỉnh sửa múi giờ vietNam
</commit_message>
<xml_diff>
--- a/BaoCao_SmartTourGuide.docx
+++ b/BaoCao_SmartTourGuide.docx
@@ -8548,8 +8548,8 @@
       </w:r>
     </w:p>
     <w:p>
-      <w:bookmarkStart w:id="2" w:name="_Toc18119"/>
-      <w:bookmarkStart w:id="3" w:name="_Toc14189"/>
+      <w:bookmarkStart w:id="2" w:name="_Toc14189"/>
+      <w:bookmarkStart w:id="3" w:name="_Toc18119"/>
     </w:p>
     <w:p>
       <w:pPr>
@@ -8593,10 +8593,10 @@
           </w14:textFill>
         </w:rPr>
       </w:pPr>
-      <w:bookmarkStart w:id="4" w:name="_Toc11365"/>
+      <w:bookmarkStart w:id="4" w:name="_Toc7939"/>
       <w:bookmarkStart w:id="5" w:name="_Toc17606"/>
       <w:bookmarkStart w:id="6" w:name="_Toc27362"/>
-      <w:bookmarkStart w:id="7" w:name="_Toc7939"/>
+      <w:bookmarkStart w:id="7" w:name="_Toc11365"/>
       <w:r>
         <w:rPr>
           <w:b/>
@@ -8770,15 +8770,15 @@
           <w:szCs w:val="26"/>
         </w:rPr>
       </w:pPr>
-      <w:bookmarkStart w:id="8" w:name="_Toc6143"/>
-      <w:bookmarkStart w:id="9" w:name="_Toc10139"/>
-      <w:bookmarkStart w:id="10" w:name="_Toc22455"/>
-      <w:bookmarkStart w:id="11" w:name="_Toc18513"/>
-      <w:bookmarkStart w:id="12" w:name="_Toc11716"/>
-      <w:bookmarkStart w:id="13" w:name="_Toc22304"/>
+      <w:bookmarkStart w:id="8" w:name="_Toc11716"/>
+      <w:bookmarkStart w:id="9" w:name="_Toc30067"/>
+      <w:bookmarkStart w:id="10" w:name="_Toc10139"/>
+      <w:bookmarkStart w:id="11" w:name="_Toc22304"/>
+      <w:bookmarkStart w:id="12" w:name="_Toc6143"/>
+      <w:bookmarkStart w:id="13" w:name="_Toc22455"/>
       <w:bookmarkStart w:id="14" w:name="_Toc30554"/>
       <w:bookmarkStart w:id="15" w:name="_Toc6055"/>
-      <w:bookmarkStart w:id="16" w:name="_Toc30067"/>
+      <w:bookmarkStart w:id="16" w:name="_Toc18513"/>
       <w:r>
         <w:rPr>
           <w:rFonts w:hint="default" w:ascii="Times New Roman" w:hAnsi="Times New Roman" w:cs="Times New Roman"/>
@@ -8810,15 +8810,15 @@
           <w:szCs w:val="26"/>
         </w:rPr>
       </w:pPr>
-      <w:bookmarkStart w:id="17" w:name="_Toc11258"/>
-      <w:bookmarkStart w:id="18" w:name="_Toc479"/>
-      <w:bookmarkStart w:id="19" w:name="_Toc7726"/>
-      <w:bookmarkStart w:id="20" w:name="_Toc8710"/>
-      <w:bookmarkStart w:id="21" w:name="_Toc12628"/>
-      <w:bookmarkStart w:id="22" w:name="_Toc30780"/>
-      <w:bookmarkStart w:id="23" w:name="_Toc20219"/>
-      <w:bookmarkStart w:id="24" w:name="_Toc10158"/>
-      <w:bookmarkStart w:id="25" w:name="_Toc14194"/>
+      <w:bookmarkStart w:id="17" w:name="_Toc7726"/>
+      <w:bookmarkStart w:id="18" w:name="_Toc30780"/>
+      <w:bookmarkStart w:id="19" w:name="_Toc8710"/>
+      <w:bookmarkStart w:id="20" w:name="_Toc12628"/>
+      <w:bookmarkStart w:id="21" w:name="_Toc10158"/>
+      <w:bookmarkStart w:id="22" w:name="_Toc11258"/>
+      <w:bookmarkStart w:id="23" w:name="_Toc479"/>
+      <w:bookmarkStart w:id="24" w:name="_Toc14194"/>
+      <w:bookmarkStart w:id="25" w:name="_Toc20219"/>
       <w:r>
         <w:rPr>
           <w:rFonts w:hint="default" w:ascii="Times New Roman" w:hAnsi="Times New Roman" w:cs="Times New Roman"/>
@@ -9066,15 +9066,15 @@
           <w:szCs w:val="26"/>
         </w:rPr>
       </w:pPr>
-      <w:bookmarkStart w:id="26" w:name="_Toc17969"/>
-      <w:bookmarkStart w:id="27" w:name="_Toc7464"/>
-      <w:bookmarkStart w:id="28" w:name="_Toc31117"/>
-      <w:bookmarkStart w:id="29" w:name="_Toc30885"/>
-      <w:bookmarkStart w:id="30" w:name="_Toc4678"/>
-      <w:bookmarkStart w:id="31" w:name="_Toc19299"/>
-      <w:bookmarkStart w:id="32" w:name="_Toc27726"/>
-      <w:bookmarkStart w:id="33" w:name="_Toc18394"/>
-      <w:bookmarkStart w:id="34" w:name="_Toc20990"/>
+      <w:bookmarkStart w:id="26" w:name="_Toc20990"/>
+      <w:bookmarkStart w:id="27" w:name="_Toc4678"/>
+      <w:bookmarkStart w:id="28" w:name="_Toc19299"/>
+      <w:bookmarkStart w:id="29" w:name="_Toc27726"/>
+      <w:bookmarkStart w:id="30" w:name="_Toc18394"/>
+      <w:bookmarkStart w:id="31" w:name="_Toc7464"/>
+      <w:bookmarkStart w:id="32" w:name="_Toc17969"/>
+      <w:bookmarkStart w:id="33" w:name="_Toc31117"/>
+      <w:bookmarkStart w:id="34" w:name="_Toc30885"/>
       <w:r>
         <w:rPr>
           <w:rFonts w:hint="default" w:ascii="Times New Roman" w:hAnsi="Times New Roman" w:cs="Times New Roman"/>
@@ -9551,15 +9551,15 @@
           <w:szCs w:val="26"/>
         </w:rPr>
       </w:pPr>
-      <w:bookmarkStart w:id="35" w:name="_Toc30018"/>
-      <w:bookmarkStart w:id="36" w:name="_Toc18331"/>
-      <w:bookmarkStart w:id="37" w:name="_Toc7076"/>
+      <w:bookmarkStart w:id="35" w:name="_Toc18331"/>
+      <w:bookmarkStart w:id="36" w:name="_Toc7076"/>
+      <w:bookmarkStart w:id="37" w:name="_Toc30018"/>
       <w:bookmarkStart w:id="38" w:name="_Toc7034"/>
       <w:bookmarkStart w:id="39" w:name="_Toc17586"/>
-      <w:bookmarkStart w:id="40" w:name="_Toc19815"/>
-      <w:bookmarkStart w:id="41" w:name="_Toc21602"/>
-      <w:bookmarkStart w:id="42" w:name="_Toc29670"/>
-      <w:bookmarkStart w:id="43" w:name="_Toc6514"/>
+      <w:bookmarkStart w:id="40" w:name="_Toc29670"/>
+      <w:bookmarkStart w:id="41" w:name="_Toc6514"/>
+      <w:bookmarkStart w:id="42" w:name="_Toc19815"/>
+      <w:bookmarkStart w:id="43" w:name="_Toc21602"/>
       <w:r>
         <w:rPr>
           <w:rFonts w:hint="default" w:ascii="Times New Roman" w:hAnsi="Times New Roman" w:cs="Times New Roman"/>
@@ -9591,15 +9591,15 @@
           <w:szCs w:val="26"/>
         </w:rPr>
       </w:pPr>
-      <w:bookmarkStart w:id="44" w:name="_Toc5462"/>
+      <w:bookmarkStart w:id="44" w:name="_Toc3959"/>
       <w:bookmarkStart w:id="45" w:name="_Toc17992"/>
-      <w:bookmarkStart w:id="46" w:name="_Toc17304"/>
+      <w:bookmarkStart w:id="46" w:name="_Toc5462"/>
       <w:bookmarkStart w:id="47" w:name="_Toc15336"/>
-      <w:bookmarkStart w:id="48" w:name="_Toc3959"/>
+      <w:bookmarkStart w:id="48" w:name="_Toc18186"/>
       <w:bookmarkStart w:id="49" w:name="_Toc23636"/>
-      <w:bookmarkStart w:id="50" w:name="_Toc11027"/>
-      <w:bookmarkStart w:id="51" w:name="_Toc21138"/>
-      <w:bookmarkStart w:id="52" w:name="_Toc18186"/>
+      <w:bookmarkStart w:id="50" w:name="_Toc21138"/>
+      <w:bookmarkStart w:id="51" w:name="_Toc11027"/>
+      <w:bookmarkStart w:id="52" w:name="_Toc17304"/>
       <w:r>
         <w:rPr>
           <w:rFonts w:hint="default" w:ascii="Times New Roman" w:hAnsi="Times New Roman" w:cs="Times New Roman"/>
@@ -9775,15 +9775,15 @@
           <w:szCs w:val="26"/>
         </w:rPr>
       </w:pPr>
-      <w:bookmarkStart w:id="53" w:name="_Toc13682"/>
+      <w:bookmarkStart w:id="53" w:name="_Toc9608"/>
       <w:bookmarkStart w:id="54" w:name="_Toc8326"/>
-      <w:bookmarkStart w:id="55" w:name="_Toc20505"/>
-      <w:bookmarkStart w:id="56" w:name="_Toc5207"/>
-      <w:bookmarkStart w:id="57" w:name="_Toc4631"/>
-      <w:bookmarkStart w:id="58" w:name="_Toc22858"/>
-      <w:bookmarkStart w:id="59" w:name="_Toc14982"/>
-      <w:bookmarkStart w:id="60" w:name="_Toc9608"/>
-      <w:bookmarkStart w:id="61" w:name="_Toc27496"/>
+      <w:bookmarkStart w:id="55" w:name="_Toc14982"/>
+      <w:bookmarkStart w:id="56" w:name="_Toc13682"/>
+      <w:bookmarkStart w:id="57" w:name="_Toc22858"/>
+      <w:bookmarkStart w:id="58" w:name="_Toc5207"/>
+      <w:bookmarkStart w:id="59" w:name="_Toc4631"/>
+      <w:bookmarkStart w:id="60" w:name="_Toc27496"/>
+      <w:bookmarkStart w:id="61" w:name="_Toc20505"/>
       <w:r>
         <w:rPr>
           <w:rFonts w:hint="default" w:ascii="Times New Roman" w:hAnsi="Times New Roman" w:cs="Times New Roman"/>
@@ -10126,15 +10126,15 @@
           <w:szCs w:val="26"/>
         </w:rPr>
       </w:pPr>
-      <w:bookmarkStart w:id="62" w:name="_Toc8111"/>
-      <w:bookmarkStart w:id="63" w:name="_Toc996"/>
-      <w:bookmarkStart w:id="64" w:name="_Toc23748"/>
-      <w:bookmarkStart w:id="65" w:name="_Toc16796"/>
-      <w:bookmarkStart w:id="66" w:name="_Toc22118"/>
-      <w:bookmarkStart w:id="67" w:name="_Toc16461"/>
-      <w:bookmarkStart w:id="68" w:name="_Toc1887"/>
-      <w:bookmarkStart w:id="69" w:name="_Toc26460"/>
-      <w:bookmarkStart w:id="70" w:name="_Toc10891"/>
+      <w:bookmarkStart w:id="62" w:name="_Toc10891"/>
+      <w:bookmarkStart w:id="63" w:name="_Toc8111"/>
+      <w:bookmarkStart w:id="64" w:name="_Toc1887"/>
+      <w:bookmarkStart w:id="65" w:name="_Toc16461"/>
+      <w:bookmarkStart w:id="66" w:name="_Toc23748"/>
+      <w:bookmarkStart w:id="67" w:name="_Toc22118"/>
+      <w:bookmarkStart w:id="68" w:name="_Toc26460"/>
+      <w:bookmarkStart w:id="69" w:name="_Toc16796"/>
+      <w:bookmarkStart w:id="70" w:name="_Toc996"/>
       <w:r>
         <w:rPr>
           <w:rFonts w:hint="default" w:ascii="Times New Roman" w:hAnsi="Times New Roman" w:cs="Times New Roman"/>
@@ -10166,15 +10166,15 @@
           <w:szCs w:val="26"/>
         </w:rPr>
       </w:pPr>
-      <w:bookmarkStart w:id="71" w:name="_Toc31203"/>
-      <w:bookmarkStart w:id="72" w:name="_Toc9832"/>
-      <w:bookmarkStart w:id="73" w:name="_Toc18643"/>
-      <w:bookmarkStart w:id="74" w:name="_Toc1942"/>
-      <w:bookmarkStart w:id="75" w:name="_Toc31643"/>
-      <w:bookmarkStart w:id="76" w:name="_Toc29924"/>
+      <w:bookmarkStart w:id="71" w:name="_Toc31643"/>
+      <w:bookmarkStart w:id="72" w:name="_Toc31203"/>
+      <w:bookmarkStart w:id="73" w:name="_Toc1942"/>
+      <w:bookmarkStart w:id="74" w:name="_Toc9832"/>
+      <w:bookmarkStart w:id="75" w:name="_Toc23769"/>
+      <w:bookmarkStart w:id="76" w:name="_Toc18643"/>
       <w:bookmarkStart w:id="77" w:name="_Toc30280"/>
-      <w:bookmarkStart w:id="78" w:name="_Toc23769"/>
-      <w:bookmarkStart w:id="79" w:name="_Toc30849"/>
+      <w:bookmarkStart w:id="78" w:name="_Toc30849"/>
+      <w:bookmarkStart w:id="79" w:name="_Toc29924"/>
       <w:r>
         <w:rPr>
           <w:rFonts w:hint="default" w:ascii="Times New Roman" w:hAnsi="Times New Roman" w:cs="Times New Roman"/>
@@ -10210,11 +10210,11 @@
       <w:bookmarkStart w:id="81" w:name="_Toc30882"/>
       <w:bookmarkStart w:id="82" w:name="_Toc16998"/>
       <w:bookmarkStart w:id="83" w:name="_Toc22915"/>
-      <w:bookmarkStart w:id="84" w:name="_Toc24639"/>
-      <w:bookmarkStart w:id="85" w:name="_Toc30046"/>
-      <w:bookmarkStart w:id="86" w:name="_Toc12214"/>
-      <w:bookmarkStart w:id="87" w:name="_Toc18954"/>
-      <w:bookmarkStart w:id="88" w:name="_Toc13885"/>
+      <w:bookmarkStart w:id="84" w:name="_Toc18954"/>
+      <w:bookmarkStart w:id="85" w:name="_Toc24639"/>
+      <w:bookmarkStart w:id="86" w:name="_Toc30046"/>
+      <w:bookmarkStart w:id="87" w:name="_Toc13885"/>
+      <w:bookmarkStart w:id="88" w:name="_Toc12214"/>
       <w:r>
         <w:rPr>
           <w:rFonts w:hint="default" w:ascii="Times New Roman" w:hAnsi="Times New Roman" w:cs="Times New Roman"/>
@@ -10466,15 +10466,15 @@
           <w:szCs w:val="26"/>
         </w:rPr>
       </w:pPr>
-      <w:bookmarkStart w:id="89" w:name="_Toc4672"/>
-      <w:bookmarkStart w:id="90" w:name="_Toc18257"/>
-      <w:bookmarkStart w:id="91" w:name="_Toc17968"/>
-      <w:bookmarkStart w:id="92" w:name="_Toc13063"/>
-      <w:bookmarkStart w:id="93" w:name="_Toc32738"/>
-      <w:bookmarkStart w:id="94" w:name="_Toc13"/>
-      <w:bookmarkStart w:id="95" w:name="_Toc1035"/>
-      <w:bookmarkStart w:id="96" w:name="_Toc19243"/>
-      <w:bookmarkStart w:id="97" w:name="_Toc27839"/>
+      <w:bookmarkStart w:id="89" w:name="_Toc27839"/>
+      <w:bookmarkStart w:id="90" w:name="_Toc19243"/>
+      <w:bookmarkStart w:id="91" w:name="_Toc1035"/>
+      <w:bookmarkStart w:id="92" w:name="_Toc13"/>
+      <w:bookmarkStart w:id="93" w:name="_Toc4672"/>
+      <w:bookmarkStart w:id="94" w:name="_Toc18257"/>
+      <w:bookmarkStart w:id="95" w:name="_Toc17968"/>
+      <w:bookmarkStart w:id="96" w:name="_Toc13063"/>
+      <w:bookmarkStart w:id="97" w:name="_Toc32738"/>
       <w:r>
         <w:rPr>
           <w:rFonts w:hint="default" w:ascii="Times New Roman" w:hAnsi="Times New Roman" w:cs="Times New Roman"/>
@@ -10719,15 +10719,15 @@
           <w:szCs w:val="26"/>
         </w:rPr>
       </w:pPr>
-      <w:bookmarkStart w:id="98" w:name="_Toc20310"/>
-      <w:bookmarkStart w:id="99" w:name="_Toc12622"/>
-      <w:bookmarkStart w:id="100" w:name="_Toc12367"/>
-      <w:bookmarkStart w:id="101" w:name="_Toc22249"/>
-      <w:bookmarkStart w:id="102" w:name="_Toc3269"/>
-      <w:bookmarkStart w:id="103" w:name="_Toc14674"/>
-      <w:bookmarkStart w:id="104" w:name="_Toc12119"/>
-      <w:bookmarkStart w:id="105" w:name="_Toc25648"/>
-      <w:bookmarkStart w:id="106" w:name="_Toc21965"/>
+      <w:bookmarkStart w:id="98" w:name="_Toc12367"/>
+      <w:bookmarkStart w:id="99" w:name="_Toc22249"/>
+      <w:bookmarkStart w:id="100" w:name="_Toc3269"/>
+      <w:bookmarkStart w:id="101" w:name="_Toc14674"/>
+      <w:bookmarkStart w:id="102" w:name="_Toc12119"/>
+      <w:bookmarkStart w:id="103" w:name="_Toc25648"/>
+      <w:bookmarkStart w:id="104" w:name="_Toc21965"/>
+      <w:bookmarkStart w:id="105" w:name="_Toc20310"/>
+      <w:bookmarkStart w:id="106" w:name="_Toc12622"/>
       <w:r>
         <w:rPr>
           <w:rFonts w:hint="default" w:ascii="Times New Roman" w:hAnsi="Times New Roman" w:cs="Times New Roman"/>
@@ -10932,14 +10932,14 @@
         </w:rPr>
       </w:pPr>
       <w:bookmarkStart w:id="107" w:name="_Toc20932"/>
-      <w:bookmarkStart w:id="108" w:name="_Toc30868"/>
-      <w:bookmarkStart w:id="109" w:name="_Toc25829"/>
-      <w:bookmarkStart w:id="110" w:name="_Toc30990"/>
-      <w:bookmarkStart w:id="111" w:name="_Toc32304"/>
-      <w:bookmarkStart w:id="112" w:name="_Toc31149"/>
-      <w:bookmarkStart w:id="113" w:name="_Toc29814"/>
-      <w:bookmarkStart w:id="114" w:name="_Toc11542"/>
-      <w:bookmarkStart w:id="115" w:name="_Toc30320"/>
+      <w:bookmarkStart w:id="108" w:name="_Toc30990"/>
+      <w:bookmarkStart w:id="109" w:name="_Toc29814"/>
+      <w:bookmarkStart w:id="110" w:name="_Toc32304"/>
+      <w:bookmarkStart w:id="111" w:name="_Toc25829"/>
+      <w:bookmarkStart w:id="112" w:name="_Toc11542"/>
+      <w:bookmarkStart w:id="113" w:name="_Toc31149"/>
+      <w:bookmarkStart w:id="114" w:name="_Toc30320"/>
+      <w:bookmarkStart w:id="115" w:name="_Toc30868"/>
       <w:r>
         <w:rPr>
           <w:rFonts w:hint="default" w:ascii="Times New Roman" w:hAnsi="Times New Roman" w:cs="Times New Roman"/>
@@ -10971,15 +10971,15 @@
           <w:szCs w:val="26"/>
         </w:rPr>
       </w:pPr>
-      <w:bookmarkStart w:id="116" w:name="_Toc29669"/>
-      <w:bookmarkStart w:id="117" w:name="_Toc5812"/>
-      <w:bookmarkStart w:id="118" w:name="_Toc5688"/>
-      <w:bookmarkStart w:id="119" w:name="_Toc28980"/>
-      <w:bookmarkStart w:id="120" w:name="_Toc5100"/>
-      <w:bookmarkStart w:id="121" w:name="_Toc2051"/>
-      <w:bookmarkStart w:id="122" w:name="_Toc32586"/>
-      <w:bookmarkStart w:id="123" w:name="_Toc24572"/>
-      <w:bookmarkStart w:id="124" w:name="_Toc12672"/>
+      <w:bookmarkStart w:id="116" w:name="_Toc2051"/>
+      <w:bookmarkStart w:id="117" w:name="_Toc12672"/>
+      <w:bookmarkStart w:id="118" w:name="_Toc32586"/>
+      <w:bookmarkStart w:id="119" w:name="_Toc24572"/>
+      <w:bookmarkStart w:id="120" w:name="_Toc5812"/>
+      <w:bookmarkStart w:id="121" w:name="_Toc29669"/>
+      <w:bookmarkStart w:id="122" w:name="_Toc5688"/>
+      <w:bookmarkStart w:id="123" w:name="_Toc28980"/>
+      <w:bookmarkStart w:id="124" w:name="_Toc5100"/>
       <w:r>
         <w:rPr>
           <w:rFonts w:hint="default" w:ascii="Times New Roman" w:hAnsi="Times New Roman" w:cs="Times New Roman"/>
@@ -11378,13 +11378,13 @@
       </w:pPr>
       <w:bookmarkStart w:id="125" w:name="_Toc17440"/>
       <w:bookmarkStart w:id="126" w:name="_Toc13646"/>
-      <w:bookmarkStart w:id="127" w:name="_Toc6472"/>
-      <w:bookmarkStart w:id="128" w:name="_Toc21502"/>
-      <w:bookmarkStart w:id="129" w:name="_Toc20805"/>
-      <w:bookmarkStart w:id="130" w:name="_Toc4443"/>
+      <w:bookmarkStart w:id="127" w:name="_Toc19692"/>
+      <w:bookmarkStart w:id="128" w:name="_Toc22419"/>
+      <w:bookmarkStart w:id="129" w:name="_Toc6472"/>
+      <w:bookmarkStart w:id="130" w:name="_Toc21502"/>
       <w:bookmarkStart w:id="131" w:name="_Toc30228"/>
-      <w:bookmarkStart w:id="132" w:name="_Toc19692"/>
-      <w:bookmarkStart w:id="133" w:name="_Toc22419"/>
+      <w:bookmarkStart w:id="132" w:name="_Toc20805"/>
+      <w:bookmarkStart w:id="133" w:name="_Toc4443"/>
       <w:r>
         <w:rPr>
           <w:rFonts w:hint="default" w:ascii="Times New Roman" w:hAnsi="Times New Roman" w:cs="Times New Roman"/>
@@ -11416,15 +11416,15 @@
           <w:szCs w:val="26"/>
         </w:rPr>
       </w:pPr>
-      <w:bookmarkStart w:id="134" w:name="_Toc16801"/>
-      <w:bookmarkStart w:id="135" w:name="_Toc15031"/>
+      <w:bookmarkStart w:id="134" w:name="_Toc15031"/>
+      <w:bookmarkStart w:id="135" w:name="_Toc16801"/>
       <w:bookmarkStart w:id="136" w:name="_Toc191"/>
-      <w:bookmarkStart w:id="137" w:name="_Toc15296"/>
-      <w:bookmarkStart w:id="138" w:name="_Toc4234"/>
-      <w:bookmarkStart w:id="139" w:name="_Toc25205"/>
-      <w:bookmarkStart w:id="140" w:name="_Toc11643"/>
-      <w:bookmarkStart w:id="141" w:name="_Toc405"/>
-      <w:bookmarkStart w:id="142" w:name="_Toc12625"/>
+      <w:bookmarkStart w:id="137" w:name="_Toc25205"/>
+      <w:bookmarkStart w:id="138" w:name="_Toc11643"/>
+      <w:bookmarkStart w:id="139" w:name="_Toc405"/>
+      <w:bookmarkStart w:id="140" w:name="_Toc12625"/>
+      <w:bookmarkStart w:id="141" w:name="_Toc15296"/>
+      <w:bookmarkStart w:id="142" w:name="_Toc4234"/>
       <w:r>
         <w:rPr>
           <w:rFonts w:hint="default" w:ascii="Times New Roman" w:hAnsi="Times New Roman" w:cs="Times New Roman"/>
@@ -11618,15 +11618,15 @@
           <w:szCs w:val="26"/>
         </w:rPr>
       </w:pPr>
-      <w:bookmarkStart w:id="143" w:name="_Toc21324"/>
-      <w:bookmarkStart w:id="144" w:name="_Toc8733"/>
-      <w:bookmarkStart w:id="145" w:name="_Toc2577"/>
-      <w:bookmarkStart w:id="146" w:name="_Toc18484"/>
-      <w:bookmarkStart w:id="147" w:name="_Toc12636"/>
-      <w:bookmarkStart w:id="148" w:name="_Toc30506"/>
-      <w:bookmarkStart w:id="149" w:name="_Toc14270"/>
-      <w:bookmarkStart w:id="150" w:name="_Toc23501"/>
-      <w:bookmarkStart w:id="151" w:name="_Toc16357"/>
+      <w:bookmarkStart w:id="143" w:name="_Toc23501"/>
+      <w:bookmarkStart w:id="144" w:name="_Toc16357"/>
+      <w:bookmarkStart w:id="145" w:name="_Toc14270"/>
+      <w:bookmarkStart w:id="146" w:name="_Toc30506"/>
+      <w:bookmarkStart w:id="147" w:name="_Toc21324"/>
+      <w:bookmarkStart w:id="148" w:name="_Toc8733"/>
+      <w:bookmarkStart w:id="149" w:name="_Toc18484"/>
+      <w:bookmarkStart w:id="150" w:name="_Toc2577"/>
+      <w:bookmarkStart w:id="151" w:name="_Toc12636"/>
       <w:r>
         <w:rPr>
           <w:rFonts w:hint="default" w:ascii="Times New Roman" w:hAnsi="Times New Roman" w:cs="Times New Roman"/>
@@ -11935,15 +11935,15 @@
           <w:szCs w:val="26"/>
         </w:rPr>
       </w:pPr>
-      <w:bookmarkStart w:id="152" w:name="_Toc28925"/>
-      <w:bookmarkStart w:id="153" w:name="_Toc8561"/>
-      <w:bookmarkStart w:id="154" w:name="_Toc2989"/>
-      <w:bookmarkStart w:id="155" w:name="_Toc23989"/>
-      <w:bookmarkStart w:id="156" w:name="_Toc26754"/>
-      <w:bookmarkStart w:id="157" w:name="_Toc21819"/>
-      <w:bookmarkStart w:id="158" w:name="_Toc22517"/>
+      <w:bookmarkStart w:id="152" w:name="_Toc23989"/>
+      <w:bookmarkStart w:id="153" w:name="_Toc26160"/>
+      <w:bookmarkStart w:id="154" w:name="_Toc22517"/>
+      <w:bookmarkStart w:id="155" w:name="_Toc26754"/>
+      <w:bookmarkStart w:id="156" w:name="_Toc28925"/>
+      <w:bookmarkStart w:id="157" w:name="_Toc8561"/>
+      <w:bookmarkStart w:id="158" w:name="_Toc2989"/>
       <w:bookmarkStart w:id="159" w:name="_Toc27861"/>
-      <w:bookmarkStart w:id="160" w:name="_Toc26160"/>
+      <w:bookmarkStart w:id="160" w:name="_Toc21819"/>
       <w:r>
         <w:rPr>
           <w:rFonts w:hint="default" w:ascii="Times New Roman" w:hAnsi="Times New Roman" w:cs="Times New Roman"/>
@@ -12256,15 +12256,15 @@
           <w:szCs w:val="26"/>
         </w:rPr>
       </w:pPr>
-      <w:bookmarkStart w:id="161" w:name="_Toc51"/>
-      <w:bookmarkStart w:id="162" w:name="_Toc8883"/>
-      <w:bookmarkStart w:id="163" w:name="_Toc18595"/>
-      <w:bookmarkStart w:id="164" w:name="_Toc7823"/>
-      <w:bookmarkStart w:id="165" w:name="_Toc26947"/>
-      <w:bookmarkStart w:id="166" w:name="_Toc23100"/>
-      <w:bookmarkStart w:id="167" w:name="_Toc31128"/>
-      <w:bookmarkStart w:id="168" w:name="_Toc6225"/>
-      <w:bookmarkStart w:id="169" w:name="_Toc1113"/>
+      <w:bookmarkStart w:id="161" w:name="_Toc23100"/>
+      <w:bookmarkStart w:id="162" w:name="_Toc7823"/>
+      <w:bookmarkStart w:id="163" w:name="_Toc31128"/>
+      <w:bookmarkStart w:id="164" w:name="_Toc6225"/>
+      <w:bookmarkStart w:id="165" w:name="_Toc18595"/>
+      <w:bookmarkStart w:id="166" w:name="_Toc1113"/>
+      <w:bookmarkStart w:id="167" w:name="_Toc8883"/>
+      <w:bookmarkStart w:id="168" w:name="_Toc51"/>
+      <w:bookmarkStart w:id="169" w:name="_Toc26947"/>
       <w:r>
         <w:rPr>
           <w:rFonts w:hint="default" w:ascii="Times New Roman" w:hAnsi="Times New Roman" w:cs="Times New Roman"/>
@@ -12296,15 +12296,15 @@
           <w:szCs w:val="26"/>
         </w:rPr>
       </w:pPr>
-      <w:bookmarkStart w:id="170" w:name="_Toc2868"/>
-      <w:bookmarkStart w:id="171" w:name="_Toc18070"/>
-      <w:bookmarkStart w:id="172" w:name="_Toc7975"/>
-      <w:bookmarkStart w:id="173" w:name="_Toc4106"/>
-      <w:bookmarkStart w:id="174" w:name="_Toc29530"/>
-      <w:bookmarkStart w:id="175" w:name="_Toc23550"/>
-      <w:bookmarkStart w:id="176" w:name="_Toc304"/>
-      <w:bookmarkStart w:id="177" w:name="_Toc13217"/>
-      <w:bookmarkStart w:id="178" w:name="_Toc21632"/>
+      <w:bookmarkStart w:id="170" w:name="_Toc7975"/>
+      <w:bookmarkStart w:id="171" w:name="_Toc29530"/>
+      <w:bookmarkStart w:id="172" w:name="_Toc2868"/>
+      <w:bookmarkStart w:id="173" w:name="_Toc23550"/>
+      <w:bookmarkStart w:id="174" w:name="_Toc304"/>
+      <w:bookmarkStart w:id="175" w:name="_Toc13217"/>
+      <w:bookmarkStart w:id="176" w:name="_Toc4106"/>
+      <w:bookmarkStart w:id="177" w:name="_Toc21632"/>
+      <w:bookmarkStart w:id="178" w:name="_Toc18070"/>
       <w:r>
         <w:rPr>
           <w:rFonts w:hint="default" w:ascii="Times New Roman" w:hAnsi="Times New Roman" w:cs="Times New Roman"/>
@@ -13101,15 +13101,15 @@
           <w:szCs w:val="26"/>
         </w:rPr>
       </w:pPr>
-      <w:bookmarkStart w:id="179" w:name="_Toc4473"/>
-      <w:bookmarkStart w:id="180" w:name="_Toc4498"/>
-      <w:bookmarkStart w:id="181" w:name="_Toc31766"/>
-      <w:bookmarkStart w:id="182" w:name="_Toc4237"/>
-      <w:bookmarkStart w:id="183" w:name="_Toc30378"/>
-      <w:bookmarkStart w:id="184" w:name="_Toc26372"/>
-      <w:bookmarkStart w:id="185" w:name="_Toc23553"/>
-      <w:bookmarkStart w:id="186" w:name="_Toc26837"/>
-      <w:bookmarkStart w:id="187" w:name="_Toc15808"/>
+      <w:bookmarkStart w:id="179" w:name="_Toc26372"/>
+      <w:bookmarkStart w:id="180" w:name="_Toc4473"/>
+      <w:bookmarkStart w:id="181" w:name="_Toc30378"/>
+      <w:bookmarkStart w:id="182" w:name="_Toc26837"/>
+      <w:bookmarkStart w:id="183" w:name="_Toc31766"/>
+      <w:bookmarkStart w:id="184" w:name="_Toc15808"/>
+      <w:bookmarkStart w:id="185" w:name="_Toc4498"/>
+      <w:bookmarkStart w:id="186" w:name="_Toc23553"/>
+      <w:bookmarkStart w:id="187" w:name="_Toc4237"/>
       <w:r>
         <w:rPr>
           <w:rFonts w:hint="default" w:ascii="Times New Roman" w:hAnsi="Times New Roman" w:cs="Times New Roman"/>
@@ -13144,15 +13144,15 @@
           <w:szCs w:val="26"/>
         </w:rPr>
       </w:pPr>
-      <w:bookmarkStart w:id="188" w:name="_Toc20323"/>
-      <w:bookmarkStart w:id="189" w:name="_Toc18880"/>
-      <w:bookmarkStart w:id="190" w:name="_Toc8378"/>
-      <w:bookmarkStart w:id="191" w:name="_Toc32427"/>
-      <w:bookmarkStart w:id="192" w:name="_Toc9657"/>
-      <w:bookmarkStart w:id="193" w:name="_Toc21825"/>
-      <w:bookmarkStart w:id="194" w:name="_Toc26598"/>
-      <w:bookmarkStart w:id="195" w:name="_Toc1400"/>
-      <w:bookmarkStart w:id="196" w:name="_Toc27721"/>
+      <w:bookmarkStart w:id="188" w:name="_Toc21825"/>
+      <w:bookmarkStart w:id="189" w:name="_Toc8378"/>
+      <w:bookmarkStart w:id="190" w:name="_Toc1400"/>
+      <w:bookmarkStart w:id="191" w:name="_Toc26598"/>
+      <w:bookmarkStart w:id="192" w:name="_Toc20323"/>
+      <w:bookmarkStart w:id="193" w:name="_Toc27721"/>
+      <w:bookmarkStart w:id="194" w:name="_Toc32427"/>
+      <w:bookmarkStart w:id="195" w:name="_Toc9657"/>
+      <w:bookmarkStart w:id="196" w:name="_Toc18880"/>
       <w:r>
         <w:rPr>
           <w:rFonts w:hint="default" w:ascii="Times New Roman" w:hAnsi="Times New Roman" w:cs="Times New Roman"/>
@@ -15436,15 +15436,15 @@
           <w:szCs w:val="26"/>
         </w:rPr>
       </w:pPr>
-      <w:bookmarkStart w:id="197" w:name="_Toc28685"/>
-      <w:bookmarkStart w:id="198" w:name="_Toc11696"/>
-      <w:bookmarkStart w:id="199" w:name="_Toc8408"/>
-      <w:bookmarkStart w:id="200" w:name="_Toc18530"/>
-      <w:bookmarkStart w:id="201" w:name="_Toc11031"/>
-      <w:bookmarkStart w:id="202" w:name="_Toc13368"/>
-      <w:bookmarkStart w:id="203" w:name="_Toc9742"/>
-      <w:bookmarkStart w:id="204" w:name="_Toc24788"/>
-      <w:bookmarkStart w:id="205" w:name="_Toc21105"/>
+      <w:bookmarkStart w:id="197" w:name="_Toc18530"/>
+      <w:bookmarkStart w:id="198" w:name="_Toc28685"/>
+      <w:bookmarkStart w:id="199" w:name="_Toc11696"/>
+      <w:bookmarkStart w:id="200" w:name="_Toc8408"/>
+      <w:bookmarkStart w:id="201" w:name="_Toc9742"/>
+      <w:bookmarkStart w:id="202" w:name="_Toc11031"/>
+      <w:bookmarkStart w:id="203" w:name="_Toc13368"/>
+      <w:bookmarkStart w:id="204" w:name="_Toc21105"/>
+      <w:bookmarkStart w:id="205" w:name="_Toc24788"/>
       <w:r>
         <w:rPr>
           <w:rFonts w:hint="default" w:ascii="Times New Roman" w:hAnsi="Times New Roman" w:cs="Times New Roman"/>
@@ -16860,15 +16860,15 @@
           <w:szCs w:val="26"/>
         </w:rPr>
       </w:pPr>
-      <w:bookmarkStart w:id="208" w:name="_Toc8633"/>
+      <w:bookmarkStart w:id="208" w:name="_Toc27768"/>
       <w:bookmarkStart w:id="209" w:name="_Toc20937"/>
-      <w:bookmarkStart w:id="210" w:name="_Toc32402"/>
-      <w:bookmarkStart w:id="211" w:name="_Toc2921"/>
+      <w:bookmarkStart w:id="210" w:name="_Toc2921"/>
+      <w:bookmarkStart w:id="211" w:name="_Toc18381"/>
       <w:bookmarkStart w:id="212" w:name="_Toc5869"/>
-      <w:bookmarkStart w:id="213" w:name="_Toc3139"/>
-      <w:bookmarkStart w:id="214" w:name="_Toc18381"/>
-      <w:bookmarkStart w:id="215" w:name="_Toc228"/>
-      <w:bookmarkStart w:id="216" w:name="_Toc27768"/>
+      <w:bookmarkStart w:id="213" w:name="_Toc228"/>
+      <w:bookmarkStart w:id="214" w:name="_Toc32402"/>
+      <w:bookmarkStart w:id="215" w:name="_Toc8633"/>
+      <w:bookmarkStart w:id="216" w:name="_Toc3139"/>
       <w:r>
         <w:rPr>
           <w:rFonts w:hint="default" w:ascii="Times New Roman" w:hAnsi="Times New Roman" w:cs="Times New Roman"/>
@@ -16900,15 +16900,15 @@
           <w:szCs w:val="26"/>
         </w:rPr>
       </w:pPr>
-      <w:bookmarkStart w:id="217" w:name="_Toc19874"/>
-      <w:bookmarkStart w:id="218" w:name="_Toc25141"/>
-      <w:bookmarkStart w:id="219" w:name="_Toc2996"/>
-      <w:bookmarkStart w:id="220" w:name="_Toc14957"/>
-      <w:bookmarkStart w:id="221" w:name="_Toc13094"/>
-      <w:bookmarkStart w:id="222" w:name="_Toc4668"/>
-      <w:bookmarkStart w:id="223" w:name="_Toc30764"/>
-      <w:bookmarkStart w:id="224" w:name="_Toc14576"/>
-      <w:bookmarkStart w:id="225" w:name="_Toc18392"/>
+      <w:bookmarkStart w:id="217" w:name="_Toc14957"/>
+      <w:bookmarkStart w:id="218" w:name="_Toc19874"/>
+      <w:bookmarkStart w:id="219" w:name="_Toc30764"/>
+      <w:bookmarkStart w:id="220" w:name="_Toc14576"/>
+      <w:bookmarkStart w:id="221" w:name="_Toc2996"/>
+      <w:bookmarkStart w:id="222" w:name="_Toc18392"/>
+      <w:bookmarkStart w:id="223" w:name="_Toc4668"/>
+      <w:bookmarkStart w:id="224" w:name="_Toc25141"/>
+      <w:bookmarkStart w:id="225" w:name="_Toc13094"/>
       <w:r>
         <w:rPr>
           <w:rFonts w:hint="default" w:ascii="Times New Roman" w:hAnsi="Times New Roman" w:cs="Times New Roman"/>
@@ -16956,22 +16956,6 @@
         <w:gridCol w:w="6679"/>
       </w:tblGrid>
       <w:tr>
-        <w:tblPrEx>
-          <w:tblBorders>
-            <w:top w:val="single" w:color="auto" w:sz="4" w:space="0"/>
-            <w:left w:val="single" w:color="auto" w:sz="4" w:space="0"/>
-            <w:bottom w:val="single" w:color="auto" w:sz="4" w:space="0"/>
-            <w:right w:val="single" w:color="auto" w:sz="4" w:space="0"/>
-            <w:insideH w:val="single" w:color="auto" w:sz="4" w:space="0"/>
-            <w:insideV w:val="single" w:color="auto" w:sz="4" w:space="0"/>
-          </w:tblBorders>
-          <w:tblCellMar>
-            <w:top w:w="0" w:type="dxa"/>
-            <w:left w:w="10" w:type="dxa"/>
-            <w:bottom w:w="0" w:type="dxa"/>
-            <w:right w:w="10" w:type="dxa"/>
-          </w:tblCellMar>
-        </w:tblPrEx>
         <w:trPr>
           <w:tblHeader/>
         </w:trPr>
@@ -17403,15 +17387,15 @@
           <w:szCs w:val="26"/>
         </w:rPr>
       </w:pPr>
-      <w:bookmarkStart w:id="226" w:name="_Toc15550"/>
+      <w:bookmarkStart w:id="226" w:name="_Toc26060"/>
       <w:bookmarkStart w:id="227" w:name="_Toc2072"/>
-      <w:bookmarkStart w:id="228" w:name="_Toc13855"/>
-      <w:bookmarkStart w:id="229" w:name="_Toc32376"/>
-      <w:bookmarkStart w:id="230" w:name="_Toc10799"/>
-      <w:bookmarkStart w:id="231" w:name="_Toc27091"/>
-      <w:bookmarkStart w:id="232" w:name="_Toc26060"/>
-      <w:bookmarkStart w:id="233" w:name="_Toc6540"/>
-      <w:bookmarkStart w:id="234" w:name="_Toc24918"/>
+      <w:bookmarkStart w:id="228" w:name="_Toc15550"/>
+      <w:bookmarkStart w:id="229" w:name="_Toc13855"/>
+      <w:bookmarkStart w:id="230" w:name="_Toc32376"/>
+      <w:bookmarkStart w:id="231" w:name="_Toc6540"/>
+      <w:bookmarkStart w:id="232" w:name="_Toc24918"/>
+      <w:bookmarkStart w:id="233" w:name="_Toc10799"/>
+      <w:bookmarkStart w:id="234" w:name="_Toc27091"/>
       <w:r>
         <w:rPr>
           <w:rFonts w:hint="default" w:ascii="Times New Roman" w:hAnsi="Times New Roman" w:cs="Times New Roman"/>
@@ -17970,15 +17954,15 @@
           <w:szCs w:val="26"/>
         </w:rPr>
       </w:pPr>
-      <w:bookmarkStart w:id="235" w:name="_Toc25967"/>
-      <w:bookmarkStart w:id="236" w:name="_Toc32533"/>
-      <w:bookmarkStart w:id="237" w:name="_Toc98"/>
-      <w:bookmarkStart w:id="238" w:name="_Toc11356"/>
-      <w:bookmarkStart w:id="239" w:name="_Toc31863"/>
+      <w:bookmarkStart w:id="235" w:name="_Toc25395"/>
+      <w:bookmarkStart w:id="236" w:name="_Toc31863"/>
+      <w:bookmarkStart w:id="237" w:name="_Toc7634"/>
+      <w:bookmarkStart w:id="238" w:name="_Toc29385"/>
+      <w:bookmarkStart w:id="239" w:name="_Toc32533"/>
       <w:bookmarkStart w:id="240" w:name="_Toc26210"/>
-      <w:bookmarkStart w:id="241" w:name="_Toc7634"/>
-      <w:bookmarkStart w:id="242" w:name="_Toc29385"/>
-      <w:bookmarkStart w:id="243" w:name="_Toc25395"/>
+      <w:bookmarkStart w:id="241" w:name="_Toc11356"/>
+      <w:bookmarkStart w:id="242" w:name="_Toc98"/>
+      <w:bookmarkStart w:id="243" w:name="_Toc25967"/>
       <w:r>
         <w:rPr>
           <w:rFonts w:hint="default" w:ascii="Times New Roman" w:hAnsi="Times New Roman" w:cs="Times New Roman"/>
@@ -18556,15 +18540,15 @@
           <w:szCs w:val="26"/>
         </w:rPr>
       </w:pPr>
-      <w:bookmarkStart w:id="244" w:name="_Toc31321"/>
-      <w:bookmarkStart w:id="245" w:name="_Toc18293"/>
-      <w:bookmarkStart w:id="246" w:name="_Toc9359"/>
-      <w:bookmarkStart w:id="247" w:name="_Toc5392"/>
-      <w:bookmarkStart w:id="248" w:name="_Toc4432"/>
-      <w:bookmarkStart w:id="249" w:name="_Toc1018"/>
-      <w:bookmarkStart w:id="250" w:name="_Toc22980"/>
-      <w:bookmarkStart w:id="251" w:name="_Toc10581"/>
-      <w:bookmarkStart w:id="252" w:name="_Toc15421"/>
+      <w:bookmarkStart w:id="244" w:name="_Toc18293"/>
+      <w:bookmarkStart w:id="245" w:name="_Toc31321"/>
+      <w:bookmarkStart w:id="246" w:name="_Toc1018"/>
+      <w:bookmarkStart w:id="247" w:name="_Toc4432"/>
+      <w:bookmarkStart w:id="248" w:name="_Toc10581"/>
+      <w:bookmarkStart w:id="249" w:name="_Toc5392"/>
+      <w:bookmarkStart w:id="250" w:name="_Toc9359"/>
+      <w:bookmarkStart w:id="251" w:name="_Toc15421"/>
+      <w:bookmarkStart w:id="252" w:name="_Toc22980"/>
       <w:r>
         <w:rPr>
           <w:rFonts w:hint="default" w:ascii="Times New Roman" w:hAnsi="Times New Roman" w:cs="Times New Roman"/>
@@ -18596,15 +18580,15 @@
           <w:szCs w:val="26"/>
         </w:rPr>
       </w:pPr>
-      <w:bookmarkStart w:id="253" w:name="_Toc16430"/>
+      <w:bookmarkStart w:id="253" w:name="_Toc290"/>
       <w:bookmarkStart w:id="254" w:name="_Toc4831"/>
-      <w:bookmarkStart w:id="255" w:name="_Toc15899"/>
-      <w:bookmarkStart w:id="256" w:name="_Toc290"/>
-      <w:bookmarkStart w:id="257" w:name="_Toc15662"/>
-      <w:bookmarkStart w:id="258" w:name="_Toc19003"/>
-      <w:bookmarkStart w:id="259" w:name="_Toc32461"/>
+      <w:bookmarkStart w:id="255" w:name="_Toc2614"/>
+      <w:bookmarkStart w:id="256" w:name="_Toc32461"/>
+      <w:bookmarkStart w:id="257" w:name="_Toc16430"/>
+      <w:bookmarkStart w:id="258" w:name="_Toc15899"/>
+      <w:bookmarkStart w:id="259" w:name="_Toc15662"/>
       <w:bookmarkStart w:id="260" w:name="_Toc21193"/>
-      <w:bookmarkStart w:id="261" w:name="_Toc2614"/>
+      <w:bookmarkStart w:id="261" w:name="_Toc19003"/>
       <w:r>
         <w:rPr>
           <w:rFonts w:hint="default" w:ascii="Times New Roman" w:hAnsi="Times New Roman" w:cs="Times New Roman"/>
@@ -18742,15 +18726,15 @@
           <w:szCs w:val="26"/>
         </w:rPr>
       </w:pPr>
-      <w:bookmarkStart w:id="262" w:name="_Toc10910"/>
-      <w:bookmarkStart w:id="263" w:name="_Toc29391"/>
-      <w:bookmarkStart w:id="264" w:name="_Toc31105"/>
+      <w:bookmarkStart w:id="262" w:name="_Toc12049"/>
+      <w:bookmarkStart w:id="263" w:name="_Toc12491"/>
+      <w:bookmarkStart w:id="264" w:name="_Toc3998"/>
       <w:bookmarkStart w:id="265" w:name="_Toc26893"/>
-      <w:bookmarkStart w:id="266" w:name="_Toc26515"/>
-      <w:bookmarkStart w:id="267" w:name="_Toc23359"/>
-      <w:bookmarkStart w:id="268" w:name="_Toc12049"/>
-      <w:bookmarkStart w:id="269" w:name="_Toc12491"/>
-      <w:bookmarkStart w:id="270" w:name="_Toc3998"/>
+      <w:bookmarkStart w:id="266" w:name="_Toc31105"/>
+      <w:bookmarkStart w:id="267" w:name="_Toc10910"/>
+      <w:bookmarkStart w:id="268" w:name="_Toc29391"/>
+      <w:bookmarkStart w:id="269" w:name="_Toc26515"/>
+      <w:bookmarkStart w:id="270" w:name="_Toc23359"/>
       <w:r>
         <w:rPr>
           <w:rFonts w:hint="default" w:ascii="Times New Roman" w:hAnsi="Times New Roman" w:cs="Times New Roman"/>
@@ -18937,13 +18921,13 @@
         </w:rPr>
       </w:pPr>
       <w:bookmarkStart w:id="271" w:name="_Toc907"/>
-      <w:bookmarkStart w:id="272" w:name="_Toc11137"/>
-      <w:bookmarkStart w:id="273" w:name="_Toc32147"/>
+      <w:bookmarkStart w:id="272" w:name="_Toc21457"/>
+      <w:bookmarkStart w:id="273" w:name="_Toc22898"/>
       <w:bookmarkStart w:id="274" w:name="_Toc30454"/>
-      <w:bookmarkStart w:id="275" w:name="_Toc21457"/>
-      <w:bookmarkStart w:id="276" w:name="_Toc5359"/>
-      <w:bookmarkStart w:id="277" w:name="_Toc22898"/>
-      <w:bookmarkStart w:id="278" w:name="_Toc9381"/>
+      <w:bookmarkStart w:id="275" w:name="_Toc9381"/>
+      <w:bookmarkStart w:id="276" w:name="_Toc11137"/>
+      <w:bookmarkStart w:id="277" w:name="_Toc5359"/>
+      <w:bookmarkStart w:id="278" w:name="_Toc32147"/>
       <w:bookmarkStart w:id="279" w:name="_Toc26454"/>
       <w:r>
         <w:rPr>
@@ -19117,15 +19101,15 @@
           <w:szCs w:val="26"/>
         </w:rPr>
       </w:pPr>
-      <w:bookmarkStart w:id="280" w:name="_Toc1396"/>
-      <w:bookmarkStart w:id="281" w:name="_Toc28595"/>
+      <w:bookmarkStart w:id="280" w:name="_Toc14610"/>
+      <w:bookmarkStart w:id="281" w:name="_Toc4281"/>
       <w:bookmarkStart w:id="282" w:name="_Toc15575"/>
-      <w:bookmarkStart w:id="283" w:name="_Toc14610"/>
-      <w:bookmarkStart w:id="284" w:name="_Toc26916"/>
-      <w:bookmarkStart w:id="285" w:name="_Toc11722"/>
-      <w:bookmarkStart w:id="286" w:name="_Toc4281"/>
-      <w:bookmarkStart w:id="287" w:name="_Toc27937"/>
-      <w:bookmarkStart w:id="288" w:name="_Toc5229"/>
+      <w:bookmarkStart w:id="283" w:name="_Toc1396"/>
+      <w:bookmarkStart w:id="284" w:name="_Toc28595"/>
+      <w:bookmarkStart w:id="285" w:name="_Toc5229"/>
+      <w:bookmarkStart w:id="286" w:name="_Toc11722"/>
+      <w:bookmarkStart w:id="287" w:name="_Toc26916"/>
+      <w:bookmarkStart w:id="288" w:name="_Toc27937"/>
       <w:r>
         <w:rPr>
           <w:rFonts w:hint="default" w:ascii="Times New Roman" w:hAnsi="Times New Roman" w:cs="Times New Roman"/>
@@ -19157,15 +19141,15 @@
           <w:szCs w:val="26"/>
         </w:rPr>
       </w:pPr>
-      <w:bookmarkStart w:id="289" w:name="_Toc1596"/>
-      <w:bookmarkStart w:id="290" w:name="_Toc31819"/>
-      <w:bookmarkStart w:id="291" w:name="_Toc20327"/>
-      <w:bookmarkStart w:id="292" w:name="_Toc812"/>
-      <w:bookmarkStart w:id="293" w:name="_Toc30469"/>
-      <w:bookmarkStart w:id="294" w:name="_Toc5297"/>
-      <w:bookmarkStart w:id="295" w:name="_Toc898"/>
-      <w:bookmarkStart w:id="296" w:name="_Toc27996"/>
-      <w:bookmarkStart w:id="297" w:name="_Toc17390"/>
+      <w:bookmarkStart w:id="289" w:name="_Toc31819"/>
+      <w:bookmarkStart w:id="290" w:name="_Toc812"/>
+      <w:bookmarkStart w:id="291" w:name="_Toc27996"/>
+      <w:bookmarkStart w:id="292" w:name="_Toc17390"/>
+      <w:bookmarkStart w:id="293" w:name="_Toc898"/>
+      <w:bookmarkStart w:id="294" w:name="_Toc1596"/>
+      <w:bookmarkStart w:id="295" w:name="_Toc20327"/>
+      <w:bookmarkStart w:id="296" w:name="_Toc5297"/>
+      <w:bookmarkStart w:id="297" w:name="_Toc30469"/>
       <w:r>
         <w:rPr>
           <w:rFonts w:hint="default" w:ascii="Times New Roman" w:hAnsi="Times New Roman" w:cs="Times New Roman"/>
@@ -20161,13 +20145,13 @@
           <w:szCs w:val="26"/>
         </w:rPr>
       </w:pPr>
-      <w:bookmarkStart w:id="298" w:name="_Toc16449"/>
-      <w:bookmarkStart w:id="299" w:name="_Toc30083"/>
+      <w:bookmarkStart w:id="298" w:name="_Toc5064"/>
+      <w:bookmarkStart w:id="299" w:name="_Toc2554"/>
       <w:bookmarkStart w:id="300" w:name="_Toc10420"/>
-      <w:bookmarkStart w:id="301" w:name="_Toc25553"/>
-      <w:bookmarkStart w:id="302" w:name="_Toc17143"/>
-      <w:bookmarkStart w:id="303" w:name="_Toc5064"/>
-      <w:bookmarkStart w:id="304" w:name="_Toc2554"/>
+      <w:bookmarkStart w:id="301" w:name="_Toc16449"/>
+      <w:bookmarkStart w:id="302" w:name="_Toc30083"/>
+      <w:bookmarkStart w:id="303" w:name="_Toc25553"/>
+      <w:bookmarkStart w:id="304" w:name="_Toc17143"/>
       <w:bookmarkStart w:id="305" w:name="_Toc12302"/>
       <w:bookmarkStart w:id="306" w:name="_Toc8395"/>
       <w:r>
@@ -20201,15 +20185,15 @@
           <w:szCs w:val="26"/>
         </w:rPr>
       </w:pPr>
-      <w:bookmarkStart w:id="307" w:name="_Toc22764"/>
-      <w:bookmarkStart w:id="308" w:name="_Toc14597"/>
-      <w:bookmarkStart w:id="309" w:name="_Toc16214"/>
-      <w:bookmarkStart w:id="310" w:name="_Toc26274"/>
-      <w:bookmarkStart w:id="311" w:name="_Toc22344"/>
-      <w:bookmarkStart w:id="312" w:name="_Toc5146"/>
-      <w:bookmarkStart w:id="313" w:name="_Toc10064"/>
-      <w:bookmarkStart w:id="314" w:name="_Toc23389"/>
-      <w:bookmarkStart w:id="315" w:name="_Toc30073"/>
+      <w:bookmarkStart w:id="307" w:name="_Toc14597"/>
+      <w:bookmarkStart w:id="308" w:name="_Toc26274"/>
+      <w:bookmarkStart w:id="309" w:name="_Toc22344"/>
+      <w:bookmarkStart w:id="310" w:name="_Toc23389"/>
+      <w:bookmarkStart w:id="311" w:name="_Toc30073"/>
+      <w:bookmarkStart w:id="312" w:name="_Toc10064"/>
+      <w:bookmarkStart w:id="313" w:name="_Toc22764"/>
+      <w:bookmarkStart w:id="314" w:name="_Toc5146"/>
+      <w:bookmarkStart w:id="315" w:name="_Toc16214"/>
       <w:r>
         <w:rPr>
           <w:rFonts w:hint="default" w:ascii="Times New Roman" w:hAnsi="Times New Roman" w:cs="Times New Roman"/>
@@ -20586,14 +20570,14 @@
           <w:szCs w:val="26"/>
         </w:rPr>
       </w:pPr>
-      <w:bookmarkStart w:id="316" w:name="_Toc13294"/>
+      <w:bookmarkStart w:id="316" w:name="_Toc2680"/>
       <w:bookmarkStart w:id="317" w:name="_Toc26343"/>
-      <w:bookmarkStart w:id="318" w:name="_Toc30950"/>
-      <w:bookmarkStart w:id="319" w:name="_Toc6516"/>
+      <w:bookmarkStart w:id="318" w:name="_Toc7665"/>
+      <w:bookmarkStart w:id="319" w:name="_Toc30950"/>
       <w:bookmarkStart w:id="320" w:name="_Toc17820"/>
-      <w:bookmarkStart w:id="321" w:name="_Toc7665"/>
-      <w:bookmarkStart w:id="322" w:name="_Toc30187"/>
-      <w:bookmarkStart w:id="323" w:name="_Toc2680"/>
+      <w:bookmarkStart w:id="321" w:name="_Toc13294"/>
+      <w:bookmarkStart w:id="322" w:name="_Toc6516"/>
+      <w:bookmarkStart w:id="323" w:name="_Toc30187"/>
       <w:bookmarkStart w:id="324" w:name="_Toc20737"/>
       <w:r>
         <w:rPr>
@@ -20856,14 +20840,14 @@
         </w:rPr>
       </w:pPr>
       <w:bookmarkStart w:id="325" w:name="_Toc5187"/>
-      <w:bookmarkStart w:id="326" w:name="_Toc26399"/>
-      <w:bookmarkStart w:id="327" w:name="_Toc21165"/>
-      <w:bookmarkStart w:id="328" w:name="_Toc25488"/>
-      <w:bookmarkStart w:id="329" w:name="_Toc32489"/>
-      <w:bookmarkStart w:id="330" w:name="_Toc30283"/>
-      <w:bookmarkStart w:id="331" w:name="_Toc24716"/>
-      <w:bookmarkStart w:id="332" w:name="_Toc7773"/>
-      <w:bookmarkStart w:id="333" w:name="_Toc25281"/>
+      <w:bookmarkStart w:id="326" w:name="_Toc30283"/>
+      <w:bookmarkStart w:id="327" w:name="_Toc26399"/>
+      <w:bookmarkStart w:id="328" w:name="_Toc24716"/>
+      <w:bookmarkStart w:id="329" w:name="_Toc25281"/>
+      <w:bookmarkStart w:id="330" w:name="_Toc7773"/>
+      <w:bookmarkStart w:id="331" w:name="_Toc32489"/>
+      <w:bookmarkStart w:id="332" w:name="_Toc21165"/>
+      <w:bookmarkStart w:id="333" w:name="_Toc25488"/>
       <w:r>
         <w:rPr>
           <w:rFonts w:hint="default" w:ascii="Times New Roman" w:hAnsi="Times New Roman" w:cs="Times New Roman"/>
@@ -21264,14 +21248,14 @@
           <w:szCs w:val="26"/>
         </w:rPr>
       </w:pPr>
-      <w:bookmarkStart w:id="334" w:name="_Toc32361"/>
-      <w:bookmarkStart w:id="335" w:name="_Toc23457"/>
-      <w:bookmarkStart w:id="336" w:name="_Toc8268"/>
-      <w:bookmarkStart w:id="337" w:name="_Toc24914"/>
-      <w:bookmarkStart w:id="338" w:name="_Toc4255"/>
-      <w:bookmarkStart w:id="339" w:name="_Toc10902"/>
-      <w:bookmarkStart w:id="340" w:name="_Toc17388"/>
-      <w:bookmarkStart w:id="341" w:name="_Toc22847"/>
+      <w:bookmarkStart w:id="334" w:name="_Toc10902"/>
+      <w:bookmarkStart w:id="335" w:name="_Toc32361"/>
+      <w:bookmarkStart w:id="336" w:name="_Toc4255"/>
+      <w:bookmarkStart w:id="337" w:name="_Toc17388"/>
+      <w:bookmarkStart w:id="338" w:name="_Toc22847"/>
+      <w:bookmarkStart w:id="339" w:name="_Toc23457"/>
+      <w:bookmarkStart w:id="340" w:name="_Toc8268"/>
+      <w:bookmarkStart w:id="341" w:name="_Toc24914"/>
       <w:bookmarkStart w:id="342" w:name="_Toc6673"/>
       <w:r>
         <w:rPr>
@@ -21484,15 +21468,15 @@
           <w:szCs w:val="26"/>
         </w:rPr>
       </w:pPr>
-      <w:bookmarkStart w:id="343" w:name="_Toc22873"/>
-      <w:bookmarkStart w:id="344" w:name="_Toc24361"/>
-      <w:bookmarkStart w:id="345" w:name="_Toc13193"/>
+      <w:bookmarkStart w:id="343" w:name="_Toc24361"/>
+      <w:bookmarkStart w:id="344" w:name="_Toc27696"/>
+      <w:bookmarkStart w:id="345" w:name="_Toc21668"/>
       <w:bookmarkStart w:id="346" w:name="_Toc21286"/>
       <w:bookmarkStart w:id="347" w:name="_Toc11519"/>
-      <w:bookmarkStart w:id="348" w:name="_Toc8705"/>
-      <w:bookmarkStart w:id="349" w:name="_Toc27696"/>
-      <w:bookmarkStart w:id="350" w:name="_Toc19537"/>
-      <w:bookmarkStart w:id="351" w:name="_Toc21668"/>
+      <w:bookmarkStart w:id="348" w:name="_Toc19537"/>
+      <w:bookmarkStart w:id="349" w:name="_Toc22873"/>
+      <w:bookmarkStart w:id="350" w:name="_Toc13193"/>
+      <w:bookmarkStart w:id="351" w:name="_Toc8705"/>
       <w:r>
         <w:rPr>
           <w:rFonts w:hint="default" w:ascii="Times New Roman" w:hAnsi="Times New Roman" w:cs="Times New Roman"/>
@@ -21693,15 +21677,15 @@
           <w:szCs w:val="26"/>
         </w:rPr>
       </w:pPr>
-      <w:bookmarkStart w:id="352" w:name="_Toc3161"/>
-      <w:bookmarkStart w:id="353" w:name="_Toc11631"/>
-      <w:bookmarkStart w:id="354" w:name="_Toc7834"/>
-      <w:bookmarkStart w:id="355" w:name="_Toc12516"/>
-      <w:bookmarkStart w:id="356" w:name="_Toc31244"/>
-      <w:bookmarkStart w:id="357" w:name="_Toc28676"/>
-      <w:bookmarkStart w:id="358" w:name="_Toc4283"/>
-      <w:bookmarkStart w:id="359" w:name="_Toc9991"/>
-      <w:bookmarkStart w:id="360" w:name="_Toc5570"/>
+      <w:bookmarkStart w:id="352" w:name="_Toc12516"/>
+      <w:bookmarkStart w:id="353" w:name="_Toc31244"/>
+      <w:bookmarkStart w:id="354" w:name="_Toc5570"/>
+      <w:bookmarkStart w:id="355" w:name="_Toc28676"/>
+      <w:bookmarkStart w:id="356" w:name="_Toc4283"/>
+      <w:bookmarkStart w:id="357" w:name="_Toc3161"/>
+      <w:bookmarkStart w:id="358" w:name="_Toc9991"/>
+      <w:bookmarkStart w:id="359" w:name="_Toc11631"/>
+      <w:bookmarkStart w:id="360" w:name="_Toc7834"/>
       <w:r>
         <w:rPr>
           <w:rFonts w:hint="default" w:ascii="Times New Roman" w:hAnsi="Times New Roman" w:cs="Times New Roman"/>
@@ -25138,8 +25122,8 @@
       <w:bookmarkStart w:id="362" w:name="_Toc5917"/>
       <w:bookmarkStart w:id="363" w:name="_Toc31960"/>
       <w:bookmarkStart w:id="364" w:name="_Toc23546"/>
-      <w:bookmarkStart w:id="365" w:name="_Toc9102"/>
-      <w:bookmarkStart w:id="366" w:name="_Toc29063"/>
+      <w:bookmarkStart w:id="365" w:name="_Toc29063"/>
+      <w:bookmarkStart w:id="366" w:name="_Toc9102"/>
       <w:bookmarkStart w:id="367" w:name="_Toc19757"/>
       <w:bookmarkStart w:id="368" w:name="_Toc32638"/>
       <w:bookmarkStart w:id="369" w:name="_Toc7650"/>
@@ -25174,14 +25158,14 @@
           <w:szCs w:val="26"/>
         </w:rPr>
       </w:pPr>
-      <w:bookmarkStart w:id="370" w:name="_Toc7181"/>
-      <w:bookmarkStart w:id="371" w:name="_Toc12816"/>
-      <w:bookmarkStart w:id="372" w:name="_Toc23202"/>
-      <w:bookmarkStart w:id="373" w:name="_Toc7310"/>
-      <w:bookmarkStart w:id="374" w:name="_Toc29521"/>
-      <w:bookmarkStart w:id="375" w:name="_Toc14090"/>
-      <w:bookmarkStart w:id="376" w:name="_Toc16794"/>
-      <w:bookmarkStart w:id="377" w:name="_Toc12942"/>
+      <w:bookmarkStart w:id="370" w:name="_Toc23202"/>
+      <w:bookmarkStart w:id="371" w:name="_Toc7181"/>
+      <w:bookmarkStart w:id="372" w:name="_Toc12816"/>
+      <w:bookmarkStart w:id="373" w:name="_Toc12942"/>
+      <w:bookmarkStart w:id="374" w:name="_Toc16794"/>
+      <w:bookmarkStart w:id="375" w:name="_Toc29521"/>
+      <w:bookmarkStart w:id="376" w:name="_Toc14090"/>
+      <w:bookmarkStart w:id="377" w:name="_Toc7310"/>
       <w:bookmarkStart w:id="378" w:name="_Toc30399"/>
       <w:r>
         <w:rPr>
@@ -26417,15 +26401,15 @@
           <w:szCs w:val="26"/>
         </w:rPr>
       </w:pPr>
-      <w:bookmarkStart w:id="379" w:name="_Toc12577"/>
-      <w:bookmarkStart w:id="380" w:name="_Toc151"/>
-      <w:bookmarkStart w:id="381" w:name="_Toc30362"/>
-      <w:bookmarkStart w:id="382" w:name="_Toc5282"/>
-      <w:bookmarkStart w:id="383" w:name="_Toc1233"/>
-      <w:bookmarkStart w:id="384" w:name="_Toc1989"/>
-      <w:bookmarkStart w:id="385" w:name="_Toc21618"/>
-      <w:bookmarkStart w:id="386" w:name="_Toc10372"/>
-      <w:bookmarkStart w:id="387" w:name="_Toc31822"/>
+      <w:bookmarkStart w:id="379" w:name="_Toc1989"/>
+      <w:bookmarkStart w:id="380" w:name="_Toc5282"/>
+      <w:bookmarkStart w:id="381" w:name="_Toc12577"/>
+      <w:bookmarkStart w:id="382" w:name="_Toc30362"/>
+      <w:bookmarkStart w:id="383" w:name="_Toc21618"/>
+      <w:bookmarkStart w:id="384" w:name="_Toc10372"/>
+      <w:bookmarkStart w:id="385" w:name="_Toc151"/>
+      <w:bookmarkStart w:id="386" w:name="_Toc31822"/>
+      <w:bookmarkStart w:id="387" w:name="_Toc1233"/>
       <w:r>
         <w:rPr>
           <w:rFonts w:hint="default" w:ascii="Times New Roman" w:hAnsi="Times New Roman" w:cs="Times New Roman"/>
@@ -27597,10 +27581,10 @@
           <w:lang w:val="en-US"/>
         </w:rPr>
       </w:pPr>
-      <w:bookmarkStart w:id="388" w:name="_Toc5727"/>
-      <w:bookmarkStart w:id="389" w:name="_Toc23246"/>
-      <w:bookmarkStart w:id="390" w:name="_Toc8070"/>
-      <w:bookmarkStart w:id="391" w:name="_Toc4663"/>
+      <w:bookmarkStart w:id="388" w:name="_Toc4663"/>
+      <w:bookmarkStart w:id="389" w:name="_Toc8070"/>
+      <w:bookmarkStart w:id="390" w:name="_Toc5727"/>
+      <w:bookmarkStart w:id="391" w:name="_Toc23246"/>
       <w:r>
         <w:rPr>
           <w:rFonts w:hint="default" w:ascii="Times New Roman" w:hAnsi="Times New Roman" w:cs="Times New Roman"/>
@@ -27667,9 +27651,9 @@
         </w:rPr>
       </w:pPr>
       <w:bookmarkStart w:id="392" w:name="_Toc31885"/>
-      <w:bookmarkStart w:id="393" w:name="_Toc11139"/>
-      <w:bookmarkStart w:id="394" w:name="_Toc12145"/>
-      <w:bookmarkStart w:id="395" w:name="_Toc15787"/>
+      <w:bookmarkStart w:id="393" w:name="_Toc15787"/>
+      <w:bookmarkStart w:id="394" w:name="_Toc11139"/>
+      <w:bookmarkStart w:id="395" w:name="_Toc12145"/>
       <w:r>
         <w:rPr>
           <w:rFonts w:hint="default" w:ascii="Times New Roman" w:hAnsi="Times New Roman" w:cs="Times New Roman"/>
@@ -30045,6 +30029,8 @@
         </w:rPr>
         <w:t>5.4.2.1. Đặc tả</w:t>
       </w:r>
+      <w:bookmarkStart w:id="476" w:name="_GoBack"/>
+      <w:bookmarkEnd w:id="476"/>
     </w:p>
     <w:tbl>
       <w:tblPr>
@@ -41198,6 +41184,7 @@
             <w:insideH w:val="single" w:color="auto" w:sz="4" w:space="0"/>
             <w:insideV w:val="single" w:color="auto" w:sz="4" w:space="0"/>
           </w:tblBorders>
+          <w:shd w:val="clear" w:color="auto" w:fill="4F81BD" w:themeFill="accent1"/>
           <w:tblCellMar>
             <w:top w:w="0" w:type="dxa"/>
             <w:left w:w="10" w:type="dxa"/>
@@ -43581,7 +43568,6 @@
             <w:insideH w:val="single" w:color="auto" w:sz="4" w:space="0"/>
             <w:insideV w:val="single" w:color="auto" w:sz="4" w:space="0"/>
           </w:tblBorders>
-          <w:shd w:val="clear" w:color="auto" w:fill="4F81BD" w:themeFill="accent1"/>
           <w:tblCellMar>
             <w:top w:w="0" w:type="dxa"/>
             <w:left w:w="10" w:type="dxa"/>
@@ -44645,7 +44631,6 @@
             <w:insideH w:val="single" w:color="auto" w:sz="4" w:space="0"/>
             <w:insideV w:val="single" w:color="auto" w:sz="4" w:space="0"/>
           </w:tblBorders>
-          <w:shd w:val="clear" w:color="auto" w:fill="4F81BD" w:themeFill="accent1"/>
           <w:tblCellMar>
             <w:top w:w="0" w:type="dxa"/>
             <w:left w:w="10" w:type="dxa"/>
@@ -45080,7 +45065,7 @@
     <w:p>
       <w:pPr>
         <w:spacing w:line="312" w:lineRule="auto"/>
-        <w:outlineLvl w:val="1"/>
+        <w:outlineLvl w:val="9"/>
         <w:rPr>
           <w:rFonts w:hint="default" w:cs="Times New Roman"/>
           <w:b/>
@@ -46514,6 +46499,7 @@
               <w:pageBreakBefore w:val="0"/>
               <w:widowControl/>
               <w:numPr>
+                <w:ilvl w:val="0"/>
                 <w:numId w:val="0"/>
               </w:numPr>
               <w:kinsoku/>
@@ -46582,7 +46568,7 @@
     <w:p>
       <w:pPr>
         <w:spacing w:line="312" w:lineRule="auto"/>
-        <w:outlineLvl w:val="1"/>
+        <w:outlineLvl w:val="9"/>
         <w:rPr>
           <w:rFonts w:hint="default" w:cs="Times New Roman"/>
           <w:b/>
@@ -46624,7 +46610,7 @@
     <w:p>
       <w:pPr>
         <w:spacing w:line="312" w:lineRule="auto"/>
-        <w:outlineLvl w:val="1"/>
+        <w:outlineLvl w:val="9"/>
         <w:rPr>
           <w:rFonts w:hint="default" w:cs="Times New Roman"/>
           <w:b/>
@@ -46662,8 +46648,6 @@
         </w:rPr>
         <w:t>5.6.2.3. Sequence Diagram</w:t>
       </w:r>
-      <w:bookmarkStart w:id="476" w:name="_GoBack"/>
-      <w:bookmarkEnd w:id="476"/>
       <w:r>
         <w:rPr>
           <w:rFonts w:hint="default" w:cs="Times New Roman"/>
@@ -46762,15 +46746,15 @@
           <w:szCs w:val="26"/>
         </w:rPr>
       </w:pPr>
-      <w:bookmarkStart w:id="404" w:name="_Toc28308"/>
-      <w:bookmarkStart w:id="405" w:name="_Toc28615"/>
-      <w:bookmarkStart w:id="406" w:name="_Toc16426"/>
-      <w:bookmarkStart w:id="407" w:name="_Toc12853"/>
-      <w:bookmarkStart w:id="408" w:name="_Toc22429"/>
-      <w:bookmarkStart w:id="409" w:name="_Toc17745"/>
-      <w:bookmarkStart w:id="410" w:name="_Toc30344"/>
-      <w:bookmarkStart w:id="411" w:name="_Toc13384"/>
-      <w:bookmarkStart w:id="412" w:name="_Toc592"/>
+      <w:bookmarkStart w:id="404" w:name="_Toc16426"/>
+      <w:bookmarkStart w:id="405" w:name="_Toc12853"/>
+      <w:bookmarkStart w:id="406" w:name="_Toc22429"/>
+      <w:bookmarkStart w:id="407" w:name="_Toc13384"/>
+      <w:bookmarkStart w:id="408" w:name="_Toc592"/>
+      <w:bookmarkStart w:id="409" w:name="_Toc30344"/>
+      <w:bookmarkStart w:id="410" w:name="_Toc17745"/>
+      <w:bookmarkStart w:id="411" w:name="_Toc28615"/>
+      <w:bookmarkStart w:id="412" w:name="_Toc28308"/>
       <w:r>
         <w:rPr>
           <w:rFonts w:hint="default" w:ascii="Times New Roman" w:hAnsi="Times New Roman" w:cs="Times New Roman"/>
@@ -46825,15 +46809,15 @@
           <w:szCs w:val="26"/>
         </w:rPr>
       </w:pPr>
-      <w:bookmarkStart w:id="413" w:name="_Toc3011"/>
-      <w:bookmarkStart w:id="414" w:name="_Toc6340"/>
-      <w:bookmarkStart w:id="415" w:name="_Toc17812"/>
-      <w:bookmarkStart w:id="416" w:name="_Toc24576"/>
-      <w:bookmarkStart w:id="417" w:name="_Toc31438"/>
-      <w:bookmarkStart w:id="418" w:name="_Toc25433"/>
-      <w:bookmarkStart w:id="419" w:name="_Toc21386"/>
-      <w:bookmarkStart w:id="420" w:name="_Toc14110"/>
-      <w:bookmarkStart w:id="421" w:name="_Toc20406"/>
+      <w:bookmarkStart w:id="413" w:name="_Toc31438"/>
+      <w:bookmarkStart w:id="414" w:name="_Toc17812"/>
+      <w:bookmarkStart w:id="415" w:name="_Toc25433"/>
+      <w:bookmarkStart w:id="416" w:name="_Toc6340"/>
+      <w:bookmarkStart w:id="417" w:name="_Toc20406"/>
+      <w:bookmarkStart w:id="418" w:name="_Toc21386"/>
+      <w:bookmarkStart w:id="419" w:name="_Toc14110"/>
+      <w:bookmarkStart w:id="420" w:name="_Toc3011"/>
+      <w:bookmarkStart w:id="421" w:name="_Toc24576"/>
       <w:r>
         <w:rPr>
           <w:rFonts w:hint="default" w:cs="Times New Roman"/>
@@ -48340,15 +48324,15 @@
           <w:szCs w:val="26"/>
         </w:rPr>
       </w:pPr>
-      <w:bookmarkStart w:id="422" w:name="_Toc3312"/>
-      <w:bookmarkStart w:id="423" w:name="_Toc30857"/>
-      <w:bookmarkStart w:id="424" w:name="_Toc6509"/>
-      <w:bookmarkStart w:id="425" w:name="_Toc28222"/>
-      <w:bookmarkStart w:id="426" w:name="_Toc32003"/>
-      <w:bookmarkStart w:id="427" w:name="_Toc11491"/>
-      <w:bookmarkStart w:id="428" w:name="_Toc21518"/>
-      <w:bookmarkStart w:id="429" w:name="_Toc9861"/>
-      <w:bookmarkStart w:id="430" w:name="_Toc16789"/>
+      <w:bookmarkStart w:id="422" w:name="_Toc11491"/>
+      <w:bookmarkStart w:id="423" w:name="_Toc28222"/>
+      <w:bookmarkStart w:id="424" w:name="_Toc3312"/>
+      <w:bookmarkStart w:id="425" w:name="_Toc16789"/>
+      <w:bookmarkStart w:id="426" w:name="_Toc6509"/>
+      <w:bookmarkStart w:id="427" w:name="_Toc21518"/>
+      <w:bookmarkStart w:id="428" w:name="_Toc9861"/>
+      <w:bookmarkStart w:id="429" w:name="_Toc30857"/>
+      <w:bookmarkStart w:id="430" w:name="_Toc32003"/>
       <w:r>
         <w:rPr>
           <w:rFonts w:hint="default" w:cs="Times New Roman"/>
@@ -48827,15 +48811,15 @@
           <w:szCs w:val="26"/>
         </w:rPr>
       </w:pPr>
-      <w:bookmarkStart w:id="431" w:name="_Toc22716"/>
-      <w:bookmarkStart w:id="432" w:name="_Toc14281"/>
-      <w:bookmarkStart w:id="433" w:name="_Toc24671"/>
-      <w:bookmarkStart w:id="434" w:name="_Toc2247"/>
-      <w:bookmarkStart w:id="435" w:name="_Toc24590"/>
-      <w:bookmarkStart w:id="436" w:name="_Toc13288"/>
-      <w:bookmarkStart w:id="437" w:name="_Toc25376"/>
-      <w:bookmarkStart w:id="438" w:name="_Toc21178"/>
-      <w:bookmarkStart w:id="439" w:name="_Toc11878"/>
+      <w:bookmarkStart w:id="431" w:name="_Toc24590"/>
+      <w:bookmarkStart w:id="432" w:name="_Toc25376"/>
+      <w:bookmarkStart w:id="433" w:name="_Toc11878"/>
+      <w:bookmarkStart w:id="434" w:name="_Toc14281"/>
+      <w:bookmarkStart w:id="435" w:name="_Toc22716"/>
+      <w:bookmarkStart w:id="436" w:name="_Toc24671"/>
+      <w:bookmarkStart w:id="437" w:name="_Toc21178"/>
+      <w:bookmarkStart w:id="438" w:name="_Toc2247"/>
+      <w:bookmarkStart w:id="439" w:name="_Toc13288"/>
       <w:r>
         <w:rPr>
           <w:rFonts w:hint="default" w:cs="Times New Roman"/>
@@ -48879,15 +48863,15 @@
           <w:szCs w:val="26"/>
         </w:rPr>
       </w:pPr>
-      <w:bookmarkStart w:id="440" w:name="_Toc20484"/>
-      <w:bookmarkStart w:id="441" w:name="_Toc4317"/>
-      <w:bookmarkStart w:id="442" w:name="_Toc14794"/>
-      <w:bookmarkStart w:id="443" w:name="_Toc18985"/>
-      <w:bookmarkStart w:id="444" w:name="_Toc10563"/>
-      <w:bookmarkStart w:id="445" w:name="_Toc14363"/>
-      <w:bookmarkStart w:id="446" w:name="_Toc20069"/>
-      <w:bookmarkStart w:id="447" w:name="_Toc14916"/>
-      <w:bookmarkStart w:id="448" w:name="_Toc7112"/>
+      <w:bookmarkStart w:id="440" w:name="_Toc4317"/>
+      <w:bookmarkStart w:id="441" w:name="_Toc10563"/>
+      <w:bookmarkStart w:id="442" w:name="_Toc14363"/>
+      <w:bookmarkStart w:id="443" w:name="_Toc20069"/>
+      <w:bookmarkStart w:id="444" w:name="_Toc20484"/>
+      <w:bookmarkStart w:id="445" w:name="_Toc14794"/>
+      <w:bookmarkStart w:id="446" w:name="_Toc14916"/>
+      <w:bookmarkStart w:id="447" w:name="_Toc7112"/>
+      <w:bookmarkStart w:id="448" w:name="_Toc18985"/>
       <w:r>
         <w:rPr>
           <w:rFonts w:hint="default" w:cs="Times New Roman"/>
@@ -49145,15 +49129,15 @@
           <w:szCs w:val="26"/>
         </w:rPr>
       </w:pPr>
-      <w:bookmarkStart w:id="449" w:name="_Toc19826"/>
+      <w:bookmarkStart w:id="449" w:name="_Toc24781"/>
       <w:bookmarkStart w:id="450" w:name="_Toc1026"/>
-      <w:bookmarkStart w:id="451" w:name="_Toc10085"/>
-      <w:bookmarkStart w:id="452" w:name="_Toc9195"/>
+      <w:bookmarkStart w:id="451" w:name="_Toc2427"/>
+      <w:bookmarkStart w:id="452" w:name="_Toc5745"/>
       <w:bookmarkStart w:id="453" w:name="_Toc14243"/>
-      <w:bookmarkStart w:id="454" w:name="_Toc5745"/>
-      <w:bookmarkStart w:id="455" w:name="_Toc24781"/>
+      <w:bookmarkStart w:id="454" w:name="_Toc19826"/>
+      <w:bookmarkStart w:id="455" w:name="_Toc9195"/>
       <w:bookmarkStart w:id="456" w:name="_Toc3945"/>
-      <w:bookmarkStart w:id="457" w:name="_Toc2427"/>
+      <w:bookmarkStart w:id="457" w:name="_Toc10085"/>
       <w:r>
         <w:rPr>
           <w:rFonts w:hint="default" w:cs="Times New Roman"/>
@@ -49395,12 +49379,12 @@
       </w:pPr>
       <w:bookmarkStart w:id="458" w:name="_Toc11918"/>
       <w:bookmarkStart w:id="459" w:name="_Toc1147"/>
-      <w:bookmarkStart w:id="460" w:name="_Toc30300"/>
-      <w:bookmarkStart w:id="461" w:name="_Toc19566"/>
-      <w:bookmarkStart w:id="462" w:name="_Toc29586"/>
-      <w:bookmarkStart w:id="463" w:name="_Toc22733"/>
-      <w:bookmarkStart w:id="464" w:name="_Toc4192"/>
-      <w:bookmarkStart w:id="465" w:name="_Toc12467"/>
+      <w:bookmarkStart w:id="460" w:name="_Toc19566"/>
+      <w:bookmarkStart w:id="461" w:name="_Toc29586"/>
+      <w:bookmarkStart w:id="462" w:name="_Toc30300"/>
+      <w:bookmarkStart w:id="463" w:name="_Toc4192"/>
+      <w:bookmarkStart w:id="464" w:name="_Toc12467"/>
+      <w:bookmarkStart w:id="465" w:name="_Toc22733"/>
       <w:bookmarkStart w:id="466" w:name="_Toc30732"/>
       <w:r>
         <w:rPr>
@@ -49594,15 +49578,15 @@
           <w:szCs w:val="26"/>
         </w:rPr>
       </w:pPr>
-      <w:bookmarkStart w:id="467" w:name="_Toc21208"/>
-      <w:bookmarkStart w:id="468" w:name="_Toc2703"/>
-      <w:bookmarkStart w:id="469" w:name="_Toc25873"/>
+      <w:bookmarkStart w:id="467" w:name="_Toc6344"/>
+      <w:bookmarkStart w:id="468" w:name="_Toc5438"/>
+      <w:bookmarkStart w:id="469" w:name="_Toc8551"/>
       <w:bookmarkStart w:id="470" w:name="_Toc5693"/>
-      <w:bookmarkStart w:id="471" w:name="_Toc6344"/>
-      <w:bookmarkStart w:id="472" w:name="_Toc5438"/>
-      <w:bookmarkStart w:id="473" w:name="_Toc28983"/>
-      <w:bookmarkStart w:id="474" w:name="_Toc6318"/>
-      <w:bookmarkStart w:id="475" w:name="_Toc8551"/>
+      <w:bookmarkStart w:id="471" w:name="_Toc6318"/>
+      <w:bookmarkStart w:id="472" w:name="_Toc28983"/>
+      <w:bookmarkStart w:id="473" w:name="_Toc25873"/>
+      <w:bookmarkStart w:id="474" w:name="_Toc2703"/>
+      <w:bookmarkStart w:id="475" w:name="_Toc21208"/>
       <w:r>
         <w:rPr>
           <w:rFonts w:hint="default" w:ascii="Times New Roman" w:hAnsi="Times New Roman" w:cs="Times New Roman"/>

</xml_diff>